<commit_message>
Arreglo en portada de la Documentacion externa
</commit_message>
<xml_diff>
--- a/Doc_externa.docx
+++ b/Doc_externa.docx
@@ -61,30 +61,21 @@
         </w:rPr>
       </w:pPr>
       <w:r>
-        <w:rPr>
-          <w:rFonts w:eastAsia="Times New Roman" w:cs="Times New Roman" w:ascii="Times New Roman" w:hAnsi="Times New Roman"/>
-          <w:b/>
-          <w:bCs/>
-        </w:rPr>
-      </w:r>
-      <w:bookmarkStart w:id="0" w:name="bookmark=id.f0mdybpqxltm"/>
-      <w:bookmarkStart w:id="1" w:name="bookmark=id.f0mdybpqxltm"/>
-      <w:bookmarkEnd w:id="1"/>
-    </w:p>
-    <w:p>
-      <w:pPr>
-        <w:pStyle w:val="normal1"/>
-        <w:spacing w:lineRule="auto" w:line="480" w:before="0" w:after="0"/>
-        <w:ind w:firstLine="720"/>
-        <w:jc w:val="center"/>
-        <w:rPr>
-          <w:rFonts w:ascii="Times New Roman" w:hAnsi="Times New Roman" w:eastAsia="Times New Roman" w:cs="Times New Roman"/>
-          <w:b/>
-          <w:bCs/>
-        </w:rPr>
-      </w:pPr>
-      <w:bookmarkStart w:id="2" w:name="bookmark=id.f0mdybpqxltm_Copy_1"/>
-      <w:bookmarkEnd w:id="2"/>
+        <w:rPr/>
+      </w:r>
+    </w:p>
+    <w:p>
+      <w:pPr>
+        <w:pStyle w:val="normal1"/>
+        <w:spacing w:lineRule="auto" w:line="480" w:before="0" w:after="0"/>
+        <w:ind w:firstLine="720"/>
+        <w:jc w:val="center"/>
+        <w:rPr>
+          <w:rFonts w:ascii="Times New Roman" w:hAnsi="Times New Roman" w:eastAsia="Times New Roman" w:cs="Times New Roman"/>
+          <w:b/>
+          <w:bCs/>
+        </w:rPr>
+      </w:pPr>
       <w:r>
         <w:rPr>
           <w:rFonts w:eastAsia="Times New Roman" w:cs="Times New Roman" w:ascii="Times New Roman" w:hAnsi="Times New Roman"/>
@@ -93,47 +84,28 @@
           <w:sz w:val="28"/>
           <w:szCs w:val="28"/>
         </w:rPr>
-        <w:t>Juego de Laberinto Dinámico con Matrices y Programación Orientada a Objetos en Python</w:t>
-      </w:r>
-    </w:p>
-    <w:p>
-      <w:pPr>
-        <w:pStyle w:val="normal1"/>
-        <w:spacing w:lineRule="auto" w:line="480" w:before="0" w:after="0"/>
-        <w:ind w:firstLine="720"/>
-        <w:jc w:val="center"/>
-        <w:rPr>
-          <w:rFonts w:ascii="Times New Roman" w:hAnsi="Times New Roman" w:eastAsia="Times New Roman" w:cs="Times New Roman"/>
-          <w:b/>
-          <w:bCs/>
-        </w:rPr>
-      </w:pPr>
-      <w:r>
-        <w:rPr>
-          <w:rFonts w:eastAsia="Times New Roman" w:cs="Times New Roman" w:ascii="Times New Roman" w:hAnsi="Times New Roman"/>
-          <w:b/>
-          <w:bCs/>
-        </w:rPr>
-      </w:r>
-    </w:p>
-    <w:p>
-      <w:pPr>
-        <w:pStyle w:val="normal1"/>
-        <w:spacing w:lineRule="auto" w:line="480" w:before="0" w:after="0"/>
-        <w:ind w:firstLine="720"/>
-        <w:jc w:val="center"/>
-        <w:rPr>
-          <w:rFonts w:ascii="Times New Roman" w:hAnsi="Times New Roman" w:eastAsia="Times New Roman" w:cs="Times New Roman"/>
-          <w:b/>
-          <w:bCs/>
-        </w:rPr>
-      </w:pPr>
-      <w:r>
-        <w:rPr>
-          <w:rFonts w:eastAsia="Times New Roman" w:cs="Times New Roman" w:ascii="Times New Roman" w:hAnsi="Times New Roman"/>
-          <w:b/>
-          <w:bCs/>
-        </w:rPr>
+        <w:t>Sistema Distribuido de Consulta Geográfica de ASADAS de Costa Rica utilizando Árboles Binarios y Archivos Binarios</w:t>
+      </w:r>
+    </w:p>
+    <w:p>
+      <w:pPr>
+        <w:pStyle w:val="normal1"/>
+        <w:spacing w:lineRule="auto" w:line="480" w:before="0" w:after="0"/>
+        <w:ind w:hanging="0"/>
+        <w:jc w:val="center"/>
+        <w:rPr>
+          <w:rFonts w:ascii="Times New Roman" w:hAnsi="Times New Roman" w:eastAsia="Times New Roman" w:cs="Times New Roman"/>
+          <w:b/>
+          <w:bCs/>
+        </w:rPr>
+      </w:pPr>
+      <w:r>
+        <w:rPr>
+          <w:rFonts w:eastAsia="Times New Roman" w:cs="Times New Roman" w:ascii="Times New Roman" w:hAnsi="Times New Roman"/>
+          <w:b/>
+          <w:bCs/>
+        </w:rPr>
+        <w:t xml:space="preserve"> </w:t>
       </w:r>
     </w:p>
     <w:p>
@@ -218,7 +190,7 @@
           <w:sz w:val="28"/>
           <w:szCs w:val="28"/>
         </w:rPr>
-        <w:t>INTEGRANTES:</w:t>
+        <w:t>INTEGRANTE:</w:t>
       </w:r>
     </w:p>
     <w:p>
@@ -383,7 +355,47 @@
           <w:sz w:val="28"/>
           <w:szCs w:val="28"/>
         </w:rPr>
-        <w:t>19 de Mayo de 2026</w:t>
+        <w:t>1</w:t>
+      </w:r>
+      <w:r>
+        <w:rPr>
+          <w:rFonts w:eastAsia="Times New Roman" w:cs="Times New Roman" w:ascii="Times New Roman" w:hAnsi="Times New Roman"/>
+          <w:b/>
+          <w:bCs/>
+          <w:sz w:val="28"/>
+          <w:szCs w:val="28"/>
+        </w:rPr>
+        <w:t>6</w:t>
+      </w:r>
+      <w:r>
+        <w:rPr>
+          <w:rFonts w:eastAsia="Times New Roman" w:cs="Times New Roman" w:ascii="Times New Roman" w:hAnsi="Times New Roman"/>
+          <w:b/>
+          <w:bCs/>
+          <w:sz w:val="28"/>
+          <w:szCs w:val="28"/>
+        </w:rPr>
+        <w:t xml:space="preserve"> de </w:t>
+      </w:r>
+      <w:r>
+        <w:rPr>
+          <w:rFonts w:eastAsia="Times New Roman" w:cs="Times New Roman" w:ascii="Times New Roman" w:hAnsi="Times New Roman"/>
+          <w:b/>
+          <w:bCs/>
+          <w:sz w:val="28"/>
+          <w:szCs w:val="28"/>
+        </w:rPr>
+        <w:t>Junio</w:t>
+      </w:r>
+      <w:r>
+        <w:rPr>
+          <w:rFonts w:eastAsia="Times New Roman" w:cs="Times New Roman" w:ascii="Times New Roman" w:hAnsi="Times New Roman"/>
+          <w:b/>
+          <w:bCs/>
+          <w:sz w:val="28"/>
+          <w:szCs w:val="28"/>
+        </w:rPr>
+        <w:t xml:space="preserve"> de 2026</w:t>
       </w:r>
     </w:p>
     <w:p>
@@ -578,29 +590,7 @@
           <w:lang w:val="zxx" w:eastAsia="zxx" w:bidi="zxx"/>
         </w:rPr>
         <w:tab/>
-        <w:t xml:space="preserve">El sistema utilizará un archivo binario principal para asi almacenar los registros de las ASADAS, mientras que las búsquedas por identificador, lo cual se optimizara mediante un árbol binario de búsqueda basado en el atributo id_Asada. Adicionalmente, la informacion se organiza geográficamente por provincia, cantón y distrito mediante listas enlazadas. Por otra parte, el proyecto </w:t>
-      </w:r>
-      <w:r>
-        <w:rPr>
-          <w:rFonts w:eastAsia="Times New Roman" w:cs="Times New Roman" w:ascii="Times New Roman" w:hAnsi="Times New Roman"/>
-          <w:b w:val="false"/>
-          <w:bCs w:val="false"/>
-          <w:sz w:val="24"/>
-          <w:szCs w:val="24"/>
-          <w:lang w:val="zxx" w:eastAsia="zxx" w:bidi="zxx"/>
-        </w:rPr>
-        <w:t>tiene una</w:t>
-      </w:r>
-      <w:r>
-        <w:rPr>
-          <w:rFonts w:eastAsia="Times New Roman" w:cs="Times New Roman" w:ascii="Times New Roman" w:hAnsi="Times New Roman"/>
-          <w:b w:val="false"/>
-          <w:bCs w:val="false"/>
-          <w:sz w:val="24"/>
-          <w:szCs w:val="24"/>
-          <w:lang w:val="zxx" w:eastAsia="zxx" w:bidi="zxx"/>
-        </w:rPr>
-        <w:t xml:space="preserve"> arquitectura cliente-servidor, el cual se encarga de un servidor central que mantiene actualizadas las estructuras de almacenamiento y atiende múltiples consultas remotas mediante hilos.  Además, se incluirá la generación de mapas digitales utilizando OpenStreetMap, permitiendo visualizar la ubicación de las ASADAS de manera precisa.</w:t>
+        <w:t>El sistema utilizará un archivo binario principal para asi almacenar los registros de las ASADAS, mientras que las búsquedas por identificador, lo cual se optimizara mediante un árbol binario de búsqueda basado en el atributo id_Asada. Adicionalmente, la informacion se organiza geográficamente por provincia, cantón y distrito mediante listas enlazadas. Por otra parte, el proyecto tiene una arquitectura cliente-servidor, el cual se encarga de un servidor central que mantiene actualizadas las estructuras de almacenamiento y atiende múltiples consultas remotas mediante hilos.  Además, se incluirá la generación de mapas digitales utilizando OpenStreetMap, permitiendo visualizar la ubicación de las ASADAS de manera precisa.</w:t>
       </w:r>
     </w:p>
     <w:p>
@@ -855,7 +845,15 @@
           <w:lang w:val="es-CR" w:eastAsia="zh-CN" w:bidi="hi-IN"/>
         </w:rPr>
         <w:tab/>
-      </w:r>
+        <w:t xml:space="preserve">Otro problema a resolver es la búsqueda eficiente por identificador. Si todos los registros se consultaron de forma secuencial, el tiempo de búsqueda aumentaría conforme crezca la cantidad de ASADAS almacenadas. Por esta razón, el proyecto requiere un árbol binario de búsqueda basado en el atributo id_Asada. Esta estrucutura debería permitir hacer una localización rápida de la posición del registro dentro del archivo principal, y lograr recuperar la información sin necesidad de recorrer todos los datos. </w:t>
+      </w:r>
+    </w:p>
+    <w:p>
+      <w:pPr>
+        <w:pStyle w:val="BodyText"/>
+        <w:spacing w:lineRule="auto" w:line="480" w:before="0" w:after="0"/>
+        <w:rPr/>
+      </w:pPr>
       <w:r>
         <w:rPr>
           <w:rFonts w:ascii="Times New roman" w:hAnsi="Times New roman"/>
@@ -863,33 +861,8 @@
           <w:szCs w:val="24"/>
           <w:lang w:val="es-CR" w:eastAsia="zh-CN" w:bidi="hi-IN"/>
         </w:rPr>
-        <w:t xml:space="preserve">Otro problema a resolver es la búsqueda eficiente por identificador. Si todos los registros se consultaron de forma secuencial, el tiempo de búsqueda aumentaría conforme crezca la cantidad de ASADAS almacenadas. Por esta razón, el proyecto requiere un árbol binario de búsqueda basado en el atributo id_Asada. Esta estrucutura debería permitir hacer una localización rápida de la posición del registro dentro del archivo principal, y lograr recuperar la información sin necesidad de recorrer todos los datos. </w:t>
-      </w:r>
-    </w:p>
-    <w:p>
-      <w:pPr>
-        <w:pStyle w:val="BodyText"/>
-        <w:spacing w:lineRule="auto" w:line="480" w:before="0" w:after="0"/>
-        <w:rPr/>
-      </w:pPr>
-      <w:r>
-        <w:rPr>
-          <w:rFonts w:ascii="Times New roman" w:hAnsi="Times New roman"/>
-          <w:sz w:val="24"/>
-          <w:szCs w:val="24"/>
-          <w:lang w:val="es-CR" w:eastAsia="zh-CN" w:bidi="hi-IN"/>
-        </w:rPr>
         <w:tab/>
-        <w:t xml:space="preserve">Además el sistema debe permitir búsquedas por división política. Esto introduce la necesidad de organizar la información de forma jerárquica mediante listas enlazadas. El problema en este caso es lograr representar correctamente la relación entre provincias, cantones, distritos y ASADAS. </w:t>
-      </w:r>
-      <w:r>
-        <w:rPr>
-          <w:rFonts w:ascii="Times New roman" w:hAnsi="Times New roman"/>
-          <w:sz w:val="24"/>
-          <w:szCs w:val="24"/>
-          <w:lang w:val="es-CR" w:eastAsia="zh-CN" w:bidi="hi-IN"/>
-        </w:rPr>
-        <w:t>De esta manera se garantiza que el usuario pueda navegar y obtener únicamente los registros asociados a la ubicación seleccionada.</w:t>
+        <w:t>Además el sistema debe permitir búsquedas por división política. Esto introduce la necesidad de organizar la información de forma jerárquica mediante listas enlazadas. El problema en este caso es lograr representar correctamente la relación entre provincias, cantones, distritos y ASADAS. De esta manera se garantiza que el usuario pueda navegar y obtener únicamente los registros asociados a la ubicación seleccionada.</w:t>
       </w:r>
     </w:p>
     <w:p>
@@ -923,16 +896,7 @@
           <w:lang w:val="es-CR" w:eastAsia="zh-CN" w:bidi="hi-IN"/>
         </w:rPr>
         <w:tab/>
-        <w:t xml:space="preserve">Por último, el sistema debe incorporar visualización geográfica mediante OpenStreetMap. Una de las dificultades es que las coordenadas que ofrece ARESEP se encuentran en el sistema CRTM05. </w:t>
-      </w:r>
-      <w:r>
-        <w:rPr>
-          <w:rFonts w:ascii="Times New roman" w:hAnsi="Times New roman"/>
-          <w:sz w:val="24"/>
-          <w:szCs w:val="24"/>
-          <w:lang w:val="es-CR" w:eastAsia="zh-CN" w:bidi="hi-IN"/>
-        </w:rPr>
-        <w:t xml:space="preserve">Por lo tanto, el sistema debe convertir de manera correcta las coordenadas antes de generar el mapa, asegurando que las ubicaciones se muestren de forma precisa. </w:t>
+        <w:t xml:space="preserve">Por último, el sistema debe incorporar visualización geográfica mediante OpenStreetMap. Una de las dificultades es que las coordenadas que ofrece ARESEP se encuentran en el sistema CRTM05. Por lo tanto, el sistema debe convertir de manera correcta las coordenadas antes de generar el mapa, asegurando que las ubicaciones se muestren de forma precisa. </w:t>
       </w:r>
     </w:p>
     <w:sectPr>

</xml_diff>

<commit_message>
Integra descarga robusta de datos  ARESEP
</commit_message>
<xml_diff>
--- a/Doc_externa.docx
+++ b/Doc_externa.docx
@@ -61,7 +61,11 @@
         </w:rPr>
       </w:pPr>
       <w:r>
-        <w:rPr/>
+        <w:rPr>
+          <w:rFonts w:eastAsia="Times New Roman" w:cs="Times New Roman" w:ascii="Times New Roman" w:hAnsi="Times New Roman"/>
+          <w:b/>
+          <w:bCs/>
+        </w:rPr>
       </w:r>
     </w:p>
     <w:p>
@@ -355,47 +359,27 @@
           <w:sz w:val="28"/>
           <w:szCs w:val="28"/>
         </w:rPr>
-        <w:t>1</w:t>
-      </w:r>
-      <w:r>
-        <w:rPr>
-          <w:rFonts w:eastAsia="Times New Roman" w:cs="Times New Roman" w:ascii="Times New Roman" w:hAnsi="Times New Roman"/>
-          <w:b/>
-          <w:bCs/>
-          <w:sz w:val="28"/>
-          <w:szCs w:val="28"/>
-        </w:rPr>
-        <w:t>6</w:t>
-      </w:r>
-      <w:r>
-        <w:rPr>
-          <w:rFonts w:eastAsia="Times New Roman" w:cs="Times New Roman" w:ascii="Times New Roman" w:hAnsi="Times New Roman"/>
-          <w:b/>
-          <w:bCs/>
-          <w:sz w:val="28"/>
-          <w:szCs w:val="28"/>
-        </w:rPr>
-        <w:t xml:space="preserve"> de </w:t>
-      </w:r>
-      <w:r>
-        <w:rPr>
-          <w:rFonts w:eastAsia="Times New Roman" w:cs="Times New Roman" w:ascii="Times New Roman" w:hAnsi="Times New Roman"/>
-          <w:b/>
-          <w:bCs/>
-          <w:sz w:val="28"/>
-          <w:szCs w:val="28"/>
-        </w:rPr>
-        <w:t>Junio</w:t>
-      </w:r>
-      <w:r>
-        <w:rPr>
-          <w:rFonts w:eastAsia="Times New Roman" w:cs="Times New Roman" w:ascii="Times New Roman" w:hAnsi="Times New Roman"/>
-          <w:b/>
-          <w:bCs/>
-          <w:sz w:val="28"/>
-          <w:szCs w:val="28"/>
-        </w:rPr>
-        <w:t xml:space="preserve"> de 2026</w:t>
+        <w:t>16 de Junio de 2026</w:t>
+      </w:r>
+    </w:p>
+    <w:p>
+      <w:pPr>
+        <w:pStyle w:val="normal1"/>
+        <w:spacing w:lineRule="auto" w:line="480" w:before="0" w:after="0"/>
+        <w:ind w:firstLine="720"/>
+        <w:jc w:val="center"/>
+        <w:rPr>
+          <w:rFonts w:ascii="Times New Roman" w:hAnsi="Times New Roman" w:eastAsia="Times New Roman" w:cs="Times New Roman"/>
+          <w:b/>
+          <w:bCs/>
+        </w:rPr>
+      </w:pPr>
+      <w:r>
+        <w:rPr>
+          <w:rFonts w:eastAsia="Times New Roman" w:cs="Times New Roman" w:ascii="Times New Roman" w:hAnsi="Times New Roman"/>
+          <w:b/>
+          <w:bCs/>
+        </w:rPr>
       </w:r>
     </w:p>
     <w:p>
@@ -751,6 +735,66 @@
           <w:numId w:val="0"/>
         </w:numPr>
         <w:ind w:hanging="0" w:left="0"/>
+        <w:jc w:val="both"/>
+        <w:rPr>
+          <w:rFonts w:ascii="Times New roman" w:hAnsi="Times New roman"/>
+          <w:sz w:val="24"/>
+          <w:szCs w:val="24"/>
+          <w:lang w:val="es-CR" w:eastAsia="zh-CN" w:bidi="hi-IN"/>
+        </w:rPr>
+      </w:pPr>
+      <w:r>
+        <w:rPr>
+          <w:rFonts w:ascii="Times New roman" w:hAnsi="Times New roman"/>
+          <w:sz w:val="24"/>
+          <w:szCs w:val="24"/>
+          <w:lang w:val="es-CR" w:eastAsia="zh-CN" w:bidi="hi-IN"/>
+        </w:rPr>
+      </w:r>
+    </w:p>
+    <w:p>
+      <w:pPr>
+        <w:pStyle w:val="BodyText"/>
+        <w:jc w:val="both"/>
+        <w:rPr>
+          <w:rFonts w:ascii="Times New roman" w:hAnsi="Times New roman"/>
+          <w:sz w:val="24"/>
+          <w:szCs w:val="24"/>
+          <w:lang w:val="es-CR" w:eastAsia="zh-CN" w:bidi="hi-IN"/>
+        </w:rPr>
+      </w:pPr>
+      <w:r>
+        <w:rPr>
+          <w:rFonts w:ascii="Times New roman" w:hAnsi="Times New roman"/>
+          <w:sz w:val="24"/>
+          <w:szCs w:val="24"/>
+          <w:lang w:val="es-CR" w:eastAsia="zh-CN" w:bidi="hi-IN"/>
+        </w:rPr>
+      </w:r>
+    </w:p>
+    <w:p>
+      <w:pPr>
+        <w:pStyle w:val="BodyText"/>
+        <w:jc w:val="both"/>
+        <w:rPr>
+          <w:rFonts w:ascii="Times New roman" w:hAnsi="Times New roman"/>
+          <w:sz w:val="24"/>
+          <w:szCs w:val="24"/>
+          <w:lang w:val="es-CR" w:eastAsia="zh-CN" w:bidi="hi-IN"/>
+        </w:rPr>
+      </w:pPr>
+      <w:r>
+        <w:rPr>
+          <w:rFonts w:ascii="Times New roman" w:hAnsi="Times New roman"/>
+          <w:sz w:val="24"/>
+          <w:szCs w:val="24"/>
+          <w:lang w:val="es-CR" w:eastAsia="zh-CN" w:bidi="hi-IN"/>
+        </w:rPr>
+      </w:r>
+    </w:p>
+    <w:p>
+      <w:pPr>
+        <w:pStyle w:val="BodyText"/>
         <w:jc w:val="both"/>
         <w:rPr>
           <w:rFonts w:ascii="Times New roman" w:hAnsi="Times New roman"/>

</xml_diff>

<commit_message>
Creacíon de titulos de documentacion externa
</commit_message>
<xml_diff>
--- a/Doc_externa.docx
+++ b/Doc_externa.docx
@@ -9,18 +9,17 @@
         <w:ind w:firstLine="720"/>
         <w:jc w:val="center"/>
         <w:rPr>
-          <w:rFonts w:ascii="Times New Roman" w:hAnsi="Times New Roman" w:eastAsia="Times New Roman" w:cs="Times New Roman"/>
-          <w:b/>
-          <w:bCs/>
-        </w:rPr>
-      </w:pPr>
-      <w:r>
-        <w:rPr>
-          <w:rFonts w:eastAsia="Times New Roman" w:cs="Times New Roman" w:ascii="Times New Roman" w:hAnsi="Times New Roman"/>
-          <w:b/>
-          <w:bCs/>
-          <w:sz w:val="28"/>
-          <w:szCs w:val="28"/>
+          <w:sz w:val="32"/>
+          <w:szCs w:val="32"/>
+        </w:rPr>
+      </w:pPr>
+      <w:r>
+        <w:rPr>
+          <w:rFonts w:eastAsia="Times New Roman" w:cs="Times New Roman" w:ascii="Times New Roman" w:hAnsi="Times New Roman"/>
+          <w:b/>
+          <w:bCs/>
+          <w:sz w:val="32"/>
+          <w:szCs w:val="32"/>
         </w:rPr>
         <w:t xml:space="preserve">Instituto Tecnológico de Costa Rica </w:t>
       </w:r>
@@ -32,18 +31,17 @@
         <w:ind w:firstLine="720"/>
         <w:jc w:val="center"/>
         <w:rPr>
-          <w:rFonts w:ascii="Times New Roman" w:hAnsi="Times New Roman" w:eastAsia="Times New Roman" w:cs="Times New Roman"/>
-          <w:b/>
-          <w:bCs/>
-        </w:rPr>
-      </w:pPr>
-      <w:r>
-        <w:rPr>
-          <w:rFonts w:eastAsia="Times New Roman" w:cs="Times New Roman" w:ascii="Times New Roman" w:hAnsi="Times New Roman"/>
-          <w:b/>
-          <w:bCs/>
-          <w:sz w:val="28"/>
-          <w:szCs w:val="28"/>
+          <w:sz w:val="32"/>
+          <w:szCs w:val="32"/>
+        </w:rPr>
+      </w:pPr>
+      <w:r>
+        <w:rPr>
+          <w:rFonts w:eastAsia="Times New Roman" w:cs="Times New Roman" w:ascii="Times New Roman" w:hAnsi="Times New Roman"/>
+          <w:b/>
+          <w:bCs/>
+          <w:sz w:val="32"/>
+          <w:szCs w:val="32"/>
         </w:rPr>
         <w:t xml:space="preserve">Unidad de Computación </w:t>
       </w:r>
@@ -58,13 +56,17 @@
           <w:rFonts w:ascii="Times New Roman" w:hAnsi="Times New Roman" w:eastAsia="Times New Roman" w:cs="Times New Roman"/>
           <w:b/>
           <w:bCs/>
-        </w:rPr>
-      </w:pPr>
-      <w:r>
-        <w:rPr>
-          <w:rFonts w:eastAsia="Times New Roman" w:cs="Times New Roman" w:ascii="Times New Roman" w:hAnsi="Times New Roman"/>
-          <w:b/>
-          <w:bCs/>
+          <w:sz w:val="32"/>
+          <w:szCs w:val="32"/>
+        </w:rPr>
+      </w:pPr>
+      <w:r>
+        <w:rPr>
+          <w:rFonts w:eastAsia="Times New Roman" w:cs="Times New Roman" w:ascii="Times New Roman" w:hAnsi="Times New Roman"/>
+          <w:b/>
+          <w:bCs/>
+          <w:sz w:val="32"/>
+          <w:szCs w:val="32"/>
         </w:rPr>
       </w:r>
     </w:p>
@@ -75,18 +77,17 @@
         <w:ind w:firstLine="720"/>
         <w:jc w:val="center"/>
         <w:rPr>
-          <w:rFonts w:ascii="Times New Roman" w:hAnsi="Times New Roman" w:eastAsia="Times New Roman" w:cs="Times New Roman"/>
-          <w:b/>
-          <w:bCs/>
-        </w:rPr>
-      </w:pPr>
-      <w:r>
-        <w:rPr>
-          <w:rFonts w:eastAsia="Times New Roman" w:cs="Times New Roman" w:ascii="Times New Roman" w:hAnsi="Times New Roman"/>
-          <w:b/>
-          <w:bCs/>
-          <w:sz w:val="28"/>
-          <w:szCs w:val="28"/>
+          <w:sz w:val="32"/>
+          <w:szCs w:val="32"/>
+        </w:rPr>
+      </w:pPr>
+      <w:r>
+        <w:rPr>
+          <w:rFonts w:eastAsia="Times New Roman" w:cs="Times New Roman" w:ascii="Times New Roman" w:hAnsi="Times New Roman"/>
+          <w:b/>
+          <w:bCs/>
+          <w:sz w:val="32"/>
+          <w:szCs w:val="32"/>
         </w:rPr>
         <w:t>Sistema Distribuido de Consulta Geográfica de ASADAS de Costa Rica utilizando Árboles Binarios y Archivos Binarios</w:t>
       </w:r>
@@ -98,16 +99,17 @@
         <w:ind w:hanging="0"/>
         <w:jc w:val="center"/>
         <w:rPr>
-          <w:rFonts w:ascii="Times New Roman" w:hAnsi="Times New Roman" w:eastAsia="Times New Roman" w:cs="Times New Roman"/>
-          <w:b/>
-          <w:bCs/>
-        </w:rPr>
-      </w:pPr>
-      <w:r>
-        <w:rPr>
-          <w:rFonts w:eastAsia="Times New Roman" w:cs="Times New Roman" w:ascii="Times New Roman" w:hAnsi="Times New Roman"/>
-          <w:b/>
-          <w:bCs/>
+          <w:sz w:val="32"/>
+          <w:szCs w:val="32"/>
+        </w:rPr>
+      </w:pPr>
+      <w:r>
+        <w:rPr>
+          <w:rFonts w:eastAsia="Times New Roman" w:cs="Times New Roman" w:ascii="Times New Roman" w:hAnsi="Times New Roman"/>
+          <w:b/>
+          <w:bCs/>
+          <w:sz w:val="32"/>
+          <w:szCs w:val="32"/>
         </w:rPr>
         <w:t xml:space="preserve"> </w:t>
       </w:r>
@@ -119,18 +121,17 @@
         <w:ind w:firstLine="720"/>
         <w:jc w:val="center"/>
         <w:rPr>
-          <w:rFonts w:ascii="Times New Roman" w:hAnsi="Times New Roman" w:eastAsia="Times New Roman" w:cs="Times New Roman"/>
-          <w:b/>
-          <w:bCs/>
-        </w:rPr>
-      </w:pPr>
-      <w:r>
-        <w:rPr>
-          <w:rFonts w:eastAsia="Times New Roman" w:cs="Times New Roman" w:ascii="Times New Roman" w:hAnsi="Times New Roman"/>
-          <w:b/>
-          <w:bCs/>
-          <w:sz w:val="28"/>
-          <w:szCs w:val="28"/>
+          <w:sz w:val="32"/>
+          <w:szCs w:val="32"/>
+        </w:rPr>
+      </w:pPr>
+      <w:r>
+        <w:rPr>
+          <w:rFonts w:eastAsia="Times New Roman" w:cs="Times New Roman" w:ascii="Times New Roman" w:hAnsi="Times New Roman"/>
+          <w:b/>
+          <w:bCs/>
+          <w:sz w:val="32"/>
+          <w:szCs w:val="32"/>
         </w:rPr>
         <w:t>PROFESOR:</w:t>
       </w:r>
@@ -142,14 +143,15 @@
         <w:ind w:firstLine="720"/>
         <w:jc w:val="center"/>
         <w:rPr>
-          <w:rFonts w:ascii="Times New Roman" w:hAnsi="Times New Roman" w:eastAsia="Times New Roman" w:cs="Times New Roman"/>
-        </w:rPr>
-      </w:pPr>
-      <w:r>
-        <w:rPr>
-          <w:rFonts w:eastAsia="Times New Roman" w:cs="Times New Roman" w:ascii="Times New Roman" w:hAnsi="Times New Roman"/>
-          <w:sz w:val="28"/>
-          <w:szCs w:val="28"/>
+          <w:sz w:val="32"/>
+          <w:szCs w:val="32"/>
+        </w:rPr>
+      </w:pPr>
+      <w:r>
+        <w:rPr>
+          <w:rFonts w:eastAsia="Times New Roman" w:cs="Times New Roman" w:ascii="Times New Roman" w:hAnsi="Times New Roman"/>
+          <w:sz w:val="32"/>
+          <w:szCs w:val="32"/>
         </w:rPr>
         <w:t>Leonardo Viquez Acuña</w:t>
       </w:r>
@@ -164,13 +166,17 @@
           <w:rFonts w:ascii="Times New Roman" w:hAnsi="Times New Roman" w:eastAsia="Times New Roman" w:cs="Times New Roman"/>
           <w:b/>
           <w:bCs/>
-        </w:rPr>
-      </w:pPr>
-      <w:r>
-        <w:rPr>
-          <w:rFonts w:eastAsia="Times New Roman" w:cs="Times New Roman" w:ascii="Times New Roman" w:hAnsi="Times New Roman"/>
-          <w:b/>
-          <w:bCs/>
+          <w:sz w:val="32"/>
+          <w:szCs w:val="32"/>
+        </w:rPr>
+      </w:pPr>
+      <w:r>
+        <w:rPr>
+          <w:rFonts w:eastAsia="Times New Roman" w:cs="Times New Roman" w:ascii="Times New Roman" w:hAnsi="Times New Roman"/>
+          <w:b/>
+          <w:bCs/>
+          <w:sz w:val="32"/>
+          <w:szCs w:val="32"/>
         </w:rPr>
       </w:r>
     </w:p>
@@ -181,18 +187,17 @@
         <w:ind w:firstLine="720"/>
         <w:jc w:val="center"/>
         <w:rPr>
-          <w:rFonts w:ascii="Times New Roman" w:hAnsi="Times New Roman" w:eastAsia="Times New Roman" w:cs="Times New Roman"/>
-          <w:b/>
-          <w:bCs/>
-        </w:rPr>
-      </w:pPr>
-      <w:r>
-        <w:rPr>
-          <w:rFonts w:eastAsia="Times New Roman" w:cs="Times New Roman" w:ascii="Times New Roman" w:hAnsi="Times New Roman"/>
-          <w:b/>
-          <w:bCs/>
-          <w:sz w:val="28"/>
-          <w:szCs w:val="28"/>
+          <w:sz w:val="32"/>
+          <w:szCs w:val="32"/>
+        </w:rPr>
+      </w:pPr>
+      <w:r>
+        <w:rPr>
+          <w:rFonts w:eastAsia="Times New Roman" w:cs="Times New Roman" w:ascii="Times New Roman" w:hAnsi="Times New Roman"/>
+          <w:b/>
+          <w:bCs/>
+          <w:sz w:val="32"/>
+          <w:szCs w:val="32"/>
         </w:rPr>
         <w:t>INTEGRANTE:</w:t>
       </w:r>
@@ -204,14 +209,15 @@
         <w:ind w:firstLine="720"/>
         <w:jc w:val="center"/>
         <w:rPr>
-          <w:rFonts w:ascii="Times New Roman" w:hAnsi="Times New Roman" w:eastAsia="Times New Roman" w:cs="Times New Roman"/>
-        </w:rPr>
-      </w:pPr>
-      <w:r>
-        <w:rPr>
-          <w:rFonts w:eastAsia="Times New Roman" w:cs="Times New Roman" w:ascii="Times New Roman" w:hAnsi="Times New Roman"/>
-          <w:sz w:val="28"/>
-          <w:szCs w:val="28"/>
+          <w:sz w:val="32"/>
+          <w:szCs w:val="32"/>
+        </w:rPr>
+      </w:pPr>
+      <w:r>
+        <w:rPr>
+          <w:rFonts w:eastAsia="Times New Roman" w:cs="Times New Roman" w:ascii="Times New Roman" w:hAnsi="Times New Roman"/>
+          <w:sz w:val="32"/>
+          <w:szCs w:val="32"/>
         </w:rPr>
         <w:t>Víctor Julio Chavarria Ordoñez</w:t>
       </w:r>
@@ -226,13 +232,17 @@
           <w:rFonts w:ascii="Times New Roman" w:hAnsi="Times New Roman" w:eastAsia="Times New Roman" w:cs="Times New Roman"/>
           <w:b/>
           <w:bCs/>
-        </w:rPr>
-      </w:pPr>
-      <w:r>
-        <w:rPr>
-          <w:rFonts w:eastAsia="Times New Roman" w:cs="Times New Roman" w:ascii="Times New Roman" w:hAnsi="Times New Roman"/>
-          <w:b/>
-          <w:bCs/>
+          <w:sz w:val="32"/>
+          <w:szCs w:val="32"/>
+        </w:rPr>
+      </w:pPr>
+      <w:r>
+        <w:rPr>
+          <w:rFonts w:eastAsia="Times New Roman" w:cs="Times New Roman" w:ascii="Times New Roman" w:hAnsi="Times New Roman"/>
+          <w:b/>
+          <w:bCs/>
+          <w:sz w:val="32"/>
+          <w:szCs w:val="32"/>
         </w:rPr>
       </w:r>
     </w:p>
@@ -246,13 +256,17 @@
           <w:rFonts w:ascii="Times New Roman" w:hAnsi="Times New Roman" w:eastAsia="Times New Roman" w:cs="Times New Roman"/>
           <w:b/>
           <w:bCs/>
-        </w:rPr>
-      </w:pPr>
-      <w:r>
-        <w:rPr>
-          <w:rFonts w:eastAsia="Times New Roman" w:cs="Times New Roman" w:ascii="Times New Roman" w:hAnsi="Times New Roman"/>
-          <w:b/>
-          <w:bCs/>
+          <w:sz w:val="32"/>
+          <w:szCs w:val="32"/>
+        </w:rPr>
+      </w:pPr>
+      <w:r>
+        <w:rPr>
+          <w:rFonts w:eastAsia="Times New Roman" w:cs="Times New Roman" w:ascii="Times New Roman" w:hAnsi="Times New Roman"/>
+          <w:b/>
+          <w:bCs/>
+          <w:sz w:val="32"/>
+          <w:szCs w:val="32"/>
         </w:rPr>
       </w:r>
     </w:p>
@@ -266,13 +280,17 @@
           <w:rFonts w:ascii="Times New Roman" w:hAnsi="Times New Roman" w:eastAsia="Times New Roman" w:cs="Times New Roman"/>
           <w:b/>
           <w:bCs/>
-        </w:rPr>
-      </w:pPr>
-      <w:r>
-        <w:rPr>
-          <w:rFonts w:eastAsia="Times New Roman" w:cs="Times New Roman" w:ascii="Times New Roman" w:hAnsi="Times New Roman"/>
-          <w:b/>
-          <w:bCs/>
+          <w:sz w:val="32"/>
+          <w:szCs w:val="32"/>
+        </w:rPr>
+      </w:pPr>
+      <w:r>
+        <w:rPr>
+          <w:rFonts w:eastAsia="Times New Roman" w:cs="Times New Roman" w:ascii="Times New Roman" w:hAnsi="Times New Roman"/>
+          <w:b/>
+          <w:bCs/>
+          <w:sz w:val="32"/>
+          <w:szCs w:val="32"/>
         </w:rPr>
       </w:r>
     </w:p>
@@ -283,18 +301,17 @@
         <w:ind w:firstLine="720"/>
         <w:jc w:val="center"/>
         <w:rPr>
-          <w:rFonts w:ascii="Times New Roman" w:hAnsi="Times New Roman" w:eastAsia="Times New Roman" w:cs="Times New Roman"/>
-          <w:b/>
-          <w:bCs/>
-        </w:rPr>
-      </w:pPr>
-      <w:r>
-        <w:rPr>
-          <w:rFonts w:eastAsia="Times New Roman" w:cs="Times New Roman" w:ascii="Times New Roman" w:hAnsi="Times New Roman"/>
-          <w:b/>
-          <w:bCs/>
-          <w:sz w:val="28"/>
-          <w:szCs w:val="28"/>
+          <w:sz w:val="32"/>
+          <w:szCs w:val="32"/>
+        </w:rPr>
+      </w:pPr>
+      <w:r>
+        <w:rPr>
+          <w:rFonts w:eastAsia="Times New Roman" w:cs="Times New Roman" w:ascii="Times New Roman" w:hAnsi="Times New Roman"/>
+          <w:b/>
+          <w:bCs/>
+          <w:sz w:val="32"/>
+          <w:szCs w:val="32"/>
         </w:rPr>
         <w:t>Sede San Carlos</w:t>
       </w:r>
@@ -309,13 +326,17 @@
           <w:rFonts w:ascii="Times New Roman" w:hAnsi="Times New Roman" w:eastAsia="Times New Roman" w:cs="Times New Roman"/>
           <w:b/>
           <w:bCs/>
-        </w:rPr>
-      </w:pPr>
-      <w:r>
-        <w:rPr>
-          <w:rFonts w:eastAsia="Times New Roman" w:cs="Times New Roman" w:ascii="Times New Roman" w:hAnsi="Times New Roman"/>
-          <w:b/>
-          <w:bCs/>
+          <w:sz w:val="32"/>
+          <w:szCs w:val="32"/>
+        </w:rPr>
+      </w:pPr>
+      <w:r>
+        <w:rPr>
+          <w:rFonts w:eastAsia="Times New Roman" w:cs="Times New Roman" w:ascii="Times New Roman" w:hAnsi="Times New Roman"/>
+          <w:b/>
+          <w:bCs/>
+          <w:sz w:val="32"/>
+          <w:szCs w:val="32"/>
         </w:rPr>
       </w:r>
     </w:p>
@@ -329,13 +350,17 @@
           <w:rFonts w:ascii="Times New Roman" w:hAnsi="Times New Roman" w:eastAsia="Times New Roman" w:cs="Times New Roman"/>
           <w:b/>
           <w:bCs/>
-        </w:rPr>
-      </w:pPr>
-      <w:r>
-        <w:rPr>
-          <w:rFonts w:eastAsia="Times New Roman" w:cs="Times New Roman" w:ascii="Times New Roman" w:hAnsi="Times New Roman"/>
-          <w:b/>
-          <w:bCs/>
+          <w:sz w:val="32"/>
+          <w:szCs w:val="32"/>
+        </w:rPr>
+      </w:pPr>
+      <w:r>
+        <w:rPr>
+          <w:rFonts w:eastAsia="Times New Roman" w:cs="Times New Roman" w:ascii="Times New Roman" w:hAnsi="Times New Roman"/>
+          <w:b/>
+          <w:bCs/>
+          <w:sz w:val="32"/>
+          <w:szCs w:val="32"/>
         </w:rPr>
       </w:r>
     </w:p>
@@ -346,80 +371,19 @@
         <w:ind w:firstLine="720"/>
         <w:jc w:val="center"/>
         <w:rPr>
-          <w:rFonts w:ascii="Times New Roman" w:hAnsi="Times New Roman" w:eastAsia="Times New Roman" w:cs="Times New Roman"/>
-          <w:b/>
-          <w:bCs/>
-        </w:rPr>
-      </w:pPr>
-      <w:r>
-        <w:rPr>
-          <w:rFonts w:eastAsia="Times New Roman" w:cs="Times New Roman" w:ascii="Times New Roman" w:hAnsi="Times New Roman"/>
-          <w:b/>
-          <w:bCs/>
-          <w:sz w:val="28"/>
-          <w:szCs w:val="28"/>
+          <w:sz w:val="32"/>
+          <w:szCs w:val="32"/>
+        </w:rPr>
+      </w:pPr>
+      <w:r>
+        <w:rPr>
+          <w:rFonts w:eastAsia="Times New Roman" w:cs="Times New Roman" w:ascii="Times New Roman" w:hAnsi="Times New Roman"/>
+          <w:b/>
+          <w:bCs/>
+          <w:sz w:val="32"/>
+          <w:szCs w:val="32"/>
         </w:rPr>
         <w:t>16 de Junio de 2026</w:t>
-      </w:r>
-    </w:p>
-    <w:p>
-      <w:pPr>
-        <w:pStyle w:val="normal1"/>
-        <w:spacing w:lineRule="auto" w:line="480" w:before="0" w:after="0"/>
-        <w:ind w:firstLine="720"/>
-        <w:jc w:val="center"/>
-        <w:rPr>
-          <w:rFonts w:ascii="Times New Roman" w:hAnsi="Times New Roman" w:eastAsia="Times New Roman" w:cs="Times New Roman"/>
-          <w:b/>
-          <w:bCs/>
-        </w:rPr>
-      </w:pPr>
-      <w:r>
-        <w:rPr>
-          <w:rFonts w:eastAsia="Times New Roman" w:cs="Times New Roman" w:ascii="Times New Roman" w:hAnsi="Times New Roman"/>
-          <w:b/>
-          <w:bCs/>
-        </w:rPr>
-      </w:r>
-    </w:p>
-    <w:p>
-      <w:pPr>
-        <w:pStyle w:val="normal1"/>
-        <w:spacing w:lineRule="auto" w:line="480" w:before="0" w:after="0"/>
-        <w:ind w:firstLine="720"/>
-        <w:jc w:val="center"/>
-        <w:rPr>
-          <w:rFonts w:ascii="Times New Roman" w:hAnsi="Times New Roman" w:eastAsia="Times New Roman" w:cs="Times New Roman"/>
-          <w:b/>
-          <w:bCs/>
-        </w:rPr>
-      </w:pPr>
-      <w:r>
-        <w:rPr>
-          <w:rFonts w:eastAsia="Times New Roman" w:cs="Times New Roman" w:ascii="Times New Roman" w:hAnsi="Times New Roman"/>
-          <w:b/>
-          <w:bCs/>
-        </w:rPr>
-      </w:r>
-    </w:p>
-    <w:p>
-      <w:pPr>
-        <w:pStyle w:val="normal1"/>
-        <w:spacing w:lineRule="auto" w:line="480" w:before="0" w:after="0"/>
-        <w:ind w:firstLine="720"/>
-        <w:jc w:val="center"/>
-        <w:rPr>
-          <w:rFonts w:ascii="Times New Roman" w:hAnsi="Times New Roman" w:eastAsia="Times New Roman" w:cs="Times New Roman"/>
-          <w:b/>
-          <w:bCs/>
-        </w:rPr>
-      </w:pPr>
-      <w:r>
-        <w:rPr>
-          <w:rFonts w:eastAsia="Times New Roman" w:cs="Times New Roman" w:ascii="Times New Roman" w:hAnsi="Times New Roman"/>
-          <w:b/>
-          <w:bCs/>
-        </w:rPr>
       </w:r>
     </w:p>
     <w:p>
@@ -467,7 +431,7 @@
         <w:pStyle w:val="Heading1"/>
         <w:numPr>
           <w:ilvl w:val="0"/>
-          <w:numId w:val="2"/>
+          <w:numId w:val="0"/>
         </w:numPr>
         <w:bidi w:val="0"/>
         <w:ind w:hanging="0" w:left="0"/>
@@ -814,30 +778,10 @@
     </w:p>
     <w:p>
       <w:pPr>
-        <w:pStyle w:val="BodyText"/>
-        <w:jc w:val="both"/>
-        <w:rPr>
-          <w:rFonts w:ascii="Times New roman" w:hAnsi="Times New roman"/>
-          <w:sz w:val="24"/>
-          <w:szCs w:val="24"/>
-          <w:lang w:val="es-CR" w:eastAsia="zh-CN" w:bidi="hi-IN"/>
-        </w:rPr>
-      </w:pPr>
-      <w:r>
-        <w:rPr>
-          <w:rFonts w:ascii="Times New roman" w:hAnsi="Times New roman"/>
-          <w:sz w:val="24"/>
-          <w:szCs w:val="24"/>
-          <w:lang w:val="es-CR" w:eastAsia="zh-CN" w:bidi="hi-IN"/>
-        </w:rPr>
-      </w:r>
-    </w:p>
-    <w:p>
-      <w:pPr>
         <w:pStyle w:val="Heading2"/>
         <w:numPr>
-          <w:ilvl w:val="1"/>
-          <w:numId w:val="1"/>
+          <w:ilvl w:val="0"/>
+          <w:numId w:val="0"/>
         </w:numPr>
         <w:ind w:hanging="0" w:left="0"/>
         <w:jc w:val="both"/>
@@ -941,6 +885,1089 @@
         </w:rPr>
         <w:tab/>
         <w:t xml:space="preserve">Por último, el sistema debe incorporar visualización geográfica mediante OpenStreetMap. Una de las dificultades es que las coordenadas que ofrece ARESEP se encuentran en el sistema CRTM05. Por lo tanto, el sistema debe convertir de manera correcta las coordenadas antes de generar el mapa, asegurando que las ubicaciones se muestren de forma precisa. </w:t>
+      </w:r>
+    </w:p>
+    <w:p>
+      <w:pPr>
+        <w:pStyle w:val="BodyText"/>
+        <w:spacing w:lineRule="auto" w:line="480" w:before="0" w:after="0"/>
+        <w:rPr>
+          <w:rFonts w:ascii="Times New roman" w:hAnsi="Times New roman"/>
+          <w:sz w:val="24"/>
+          <w:szCs w:val="24"/>
+          <w:lang w:val="es-CR" w:eastAsia="zh-CN" w:bidi="hi-IN"/>
+        </w:rPr>
+      </w:pPr>
+      <w:r>
+        <w:rPr/>
+      </w:r>
+    </w:p>
+    <w:p>
+      <w:pPr>
+        <w:pStyle w:val="BodyText"/>
+        <w:spacing w:lineRule="auto" w:line="480" w:before="0" w:after="0"/>
+        <w:rPr>
+          <w:rFonts w:ascii="Times New roman" w:hAnsi="Times New roman"/>
+          <w:sz w:val="24"/>
+          <w:szCs w:val="24"/>
+          <w:lang w:val="es-CR" w:eastAsia="zh-CN" w:bidi="hi-IN"/>
+        </w:rPr>
+      </w:pPr>
+      <w:r>
+        <w:rPr/>
+      </w:r>
+    </w:p>
+    <w:p>
+      <w:pPr>
+        <w:pStyle w:val="BodyText"/>
+        <w:spacing w:lineRule="auto" w:line="480" w:before="0" w:after="0"/>
+        <w:rPr>
+          <w:rFonts w:ascii="Times New roman" w:hAnsi="Times New roman"/>
+          <w:sz w:val="24"/>
+          <w:szCs w:val="24"/>
+          <w:lang w:val="es-CR" w:eastAsia="zh-CN" w:bidi="hi-IN"/>
+        </w:rPr>
+      </w:pPr>
+      <w:r>
+        <w:rPr/>
+      </w:r>
+    </w:p>
+    <w:p>
+      <w:pPr>
+        <w:pStyle w:val="BodyText"/>
+        <w:spacing w:lineRule="auto" w:line="480" w:before="0" w:after="0"/>
+        <w:rPr>
+          <w:rFonts w:ascii="Times New roman" w:hAnsi="Times New roman"/>
+          <w:sz w:val="24"/>
+          <w:szCs w:val="24"/>
+          <w:lang w:val="es-CR" w:eastAsia="zh-CN" w:bidi="hi-IN"/>
+        </w:rPr>
+      </w:pPr>
+      <w:r>
+        <w:rPr/>
+      </w:r>
+    </w:p>
+    <w:p>
+      <w:pPr>
+        <w:pStyle w:val="BodyText"/>
+        <w:spacing w:lineRule="auto" w:line="480" w:before="0" w:after="0"/>
+        <w:rPr>
+          <w:rFonts w:ascii="Times New roman" w:hAnsi="Times New roman"/>
+          <w:sz w:val="24"/>
+          <w:szCs w:val="24"/>
+          <w:lang w:val="es-CR" w:eastAsia="zh-CN" w:bidi="hi-IN"/>
+        </w:rPr>
+      </w:pPr>
+      <w:r>
+        <w:rPr/>
+      </w:r>
+    </w:p>
+    <w:p>
+      <w:pPr>
+        <w:pStyle w:val="BodyText"/>
+        <w:spacing w:lineRule="auto" w:line="480" w:before="0" w:after="0"/>
+        <w:rPr>
+          <w:rFonts w:ascii="Times New roman" w:hAnsi="Times New roman"/>
+          <w:sz w:val="24"/>
+          <w:szCs w:val="24"/>
+          <w:lang w:val="es-CR" w:eastAsia="zh-CN" w:bidi="hi-IN"/>
+        </w:rPr>
+      </w:pPr>
+      <w:r>
+        <w:rPr/>
+      </w:r>
+    </w:p>
+    <w:p>
+      <w:pPr>
+        <w:pStyle w:val="BodyText"/>
+        <w:spacing w:lineRule="auto" w:line="480" w:before="0" w:after="0"/>
+        <w:rPr>
+          <w:rFonts w:ascii="Times New roman" w:hAnsi="Times New roman"/>
+          <w:sz w:val="24"/>
+          <w:szCs w:val="24"/>
+          <w:lang w:val="es-CR" w:eastAsia="zh-CN" w:bidi="hi-IN"/>
+        </w:rPr>
+      </w:pPr>
+      <w:r>
+        <w:rPr/>
+      </w:r>
+    </w:p>
+    <w:p>
+      <w:pPr>
+        <w:pStyle w:val="BodyText"/>
+        <w:spacing w:lineRule="auto" w:line="480" w:before="0" w:after="0"/>
+        <w:rPr>
+          <w:rFonts w:ascii="Times New roman" w:hAnsi="Times New roman"/>
+          <w:sz w:val="24"/>
+          <w:szCs w:val="24"/>
+          <w:lang w:val="es-CR" w:eastAsia="zh-CN" w:bidi="hi-IN"/>
+        </w:rPr>
+      </w:pPr>
+      <w:r>
+        <w:rPr/>
+      </w:r>
+    </w:p>
+    <w:p>
+      <w:pPr>
+        <w:pStyle w:val="BodyText"/>
+        <w:spacing w:lineRule="auto" w:line="480" w:before="0" w:after="0"/>
+        <w:rPr>
+          <w:rFonts w:ascii="Times New roman" w:hAnsi="Times New roman"/>
+          <w:sz w:val="24"/>
+          <w:szCs w:val="24"/>
+          <w:lang w:val="es-CR" w:eastAsia="zh-CN" w:bidi="hi-IN"/>
+        </w:rPr>
+      </w:pPr>
+      <w:r>
+        <w:rPr/>
+      </w:r>
+    </w:p>
+    <w:p>
+      <w:pPr>
+        <w:pStyle w:val="BodyText"/>
+        <w:spacing w:lineRule="auto" w:line="480" w:before="0" w:after="0"/>
+        <w:rPr>
+          <w:rFonts w:ascii="Times New roman" w:hAnsi="Times New roman"/>
+          <w:sz w:val="24"/>
+          <w:szCs w:val="24"/>
+          <w:lang w:val="es-CR" w:eastAsia="zh-CN" w:bidi="hi-IN"/>
+        </w:rPr>
+      </w:pPr>
+      <w:r>
+        <w:rPr/>
+      </w:r>
+    </w:p>
+    <w:p>
+      <w:pPr>
+        <w:pStyle w:val="BodyText"/>
+        <w:spacing w:lineRule="auto" w:line="480" w:before="0" w:after="0"/>
+        <w:rPr>
+          <w:rFonts w:ascii="Times New roman" w:hAnsi="Times New roman"/>
+          <w:sz w:val="24"/>
+          <w:szCs w:val="24"/>
+          <w:lang w:val="es-CR" w:eastAsia="zh-CN" w:bidi="hi-IN"/>
+        </w:rPr>
+      </w:pPr>
+      <w:r>
+        <w:rPr/>
+      </w:r>
+    </w:p>
+    <w:p>
+      <w:pPr>
+        <w:pStyle w:val="BodyText"/>
+        <w:spacing w:lineRule="auto" w:line="480" w:before="0" w:after="0"/>
+        <w:rPr>
+          <w:rFonts w:ascii="Times New roman" w:hAnsi="Times New roman"/>
+          <w:sz w:val="24"/>
+          <w:szCs w:val="24"/>
+          <w:lang w:val="es-CR" w:eastAsia="zh-CN" w:bidi="hi-IN"/>
+        </w:rPr>
+      </w:pPr>
+      <w:r>
+        <w:rPr/>
+      </w:r>
+    </w:p>
+    <w:p>
+      <w:pPr>
+        <w:pStyle w:val="BodyText"/>
+        <w:spacing w:lineRule="auto" w:line="480" w:before="0" w:after="0"/>
+        <w:rPr>
+          <w:rFonts w:ascii="Times New roman" w:hAnsi="Times New roman"/>
+          <w:sz w:val="24"/>
+          <w:szCs w:val="24"/>
+          <w:lang w:val="es-CR" w:eastAsia="zh-CN" w:bidi="hi-IN"/>
+        </w:rPr>
+      </w:pPr>
+      <w:r>
+        <w:rPr/>
+      </w:r>
+    </w:p>
+    <w:p>
+      <w:pPr>
+        <w:pStyle w:val="BodyText"/>
+        <w:spacing w:lineRule="auto" w:line="480" w:before="0" w:after="0"/>
+        <w:rPr>
+          <w:rFonts w:ascii="Times New roman" w:hAnsi="Times New roman"/>
+          <w:sz w:val="24"/>
+          <w:szCs w:val="24"/>
+          <w:lang w:val="es-CR" w:eastAsia="zh-CN" w:bidi="hi-IN"/>
+        </w:rPr>
+      </w:pPr>
+      <w:r>
+        <w:rPr/>
+      </w:r>
+    </w:p>
+    <w:p>
+      <w:pPr>
+        <w:pStyle w:val="BodyText"/>
+        <w:spacing w:lineRule="auto" w:line="480" w:before="0" w:after="0"/>
+        <w:rPr>
+          <w:rFonts w:ascii="Times New roman" w:hAnsi="Times New roman"/>
+          <w:sz w:val="24"/>
+          <w:szCs w:val="24"/>
+          <w:lang w:val="es-CR" w:eastAsia="zh-CN" w:bidi="hi-IN"/>
+        </w:rPr>
+      </w:pPr>
+      <w:r>
+        <w:rPr/>
+      </w:r>
+    </w:p>
+    <w:p>
+      <w:pPr>
+        <w:pStyle w:val="BodyText"/>
+        <w:spacing w:lineRule="auto" w:line="480" w:before="0" w:after="0"/>
+        <w:rPr>
+          <w:rFonts w:ascii="Times New roman" w:hAnsi="Times New roman"/>
+          <w:sz w:val="24"/>
+          <w:szCs w:val="24"/>
+          <w:lang w:val="es-CR" w:eastAsia="zh-CN" w:bidi="hi-IN"/>
+        </w:rPr>
+      </w:pPr>
+      <w:r>
+        <w:rPr/>
+      </w:r>
+    </w:p>
+    <w:p>
+      <w:pPr>
+        <w:pStyle w:val="BodyText"/>
+        <w:spacing w:lineRule="auto" w:line="480" w:before="0" w:after="0"/>
+        <w:rPr>
+          <w:rFonts w:ascii="Times New roman" w:hAnsi="Times New roman"/>
+          <w:sz w:val="24"/>
+          <w:szCs w:val="24"/>
+          <w:lang w:val="es-CR" w:eastAsia="zh-CN" w:bidi="hi-IN"/>
+        </w:rPr>
+      </w:pPr>
+      <w:r>
+        <w:rPr/>
+      </w:r>
+    </w:p>
+    <w:p>
+      <w:pPr>
+        <w:pStyle w:val="BodyText"/>
+        <w:spacing w:lineRule="auto" w:line="480" w:before="0" w:after="0"/>
+        <w:rPr>
+          <w:rFonts w:ascii="Times New roman" w:hAnsi="Times New roman"/>
+          <w:sz w:val="24"/>
+          <w:szCs w:val="24"/>
+          <w:lang w:val="es-CR" w:eastAsia="zh-CN" w:bidi="hi-IN"/>
+        </w:rPr>
+      </w:pPr>
+      <w:r>
+        <w:rPr/>
+      </w:r>
+    </w:p>
+    <w:p>
+      <w:pPr>
+        <w:pStyle w:val="BodyText"/>
+        <w:spacing w:lineRule="auto" w:line="480" w:before="0" w:after="0"/>
+        <w:rPr>
+          <w:rFonts w:ascii="Times New roman" w:hAnsi="Times New roman"/>
+          <w:sz w:val="24"/>
+          <w:szCs w:val="24"/>
+          <w:lang w:val="es-CR" w:eastAsia="zh-CN" w:bidi="hi-IN"/>
+        </w:rPr>
+      </w:pPr>
+      <w:r>
+        <w:rPr/>
+      </w:r>
+    </w:p>
+    <w:p>
+      <w:pPr>
+        <w:pStyle w:val="BodyText"/>
+        <w:spacing w:lineRule="auto" w:line="480" w:before="0" w:after="0"/>
+        <w:rPr>
+          <w:rFonts w:ascii="Times New roman" w:hAnsi="Times New roman"/>
+          <w:sz w:val="24"/>
+          <w:szCs w:val="24"/>
+          <w:lang w:val="es-CR" w:eastAsia="zh-CN" w:bidi="hi-IN"/>
+        </w:rPr>
+      </w:pPr>
+      <w:r>
+        <w:rPr/>
+      </w:r>
+    </w:p>
+    <w:p>
+      <w:pPr>
+        <w:pStyle w:val="BodyText"/>
+        <w:spacing w:lineRule="auto" w:line="480" w:before="0" w:after="0"/>
+        <w:rPr>
+          <w:rFonts w:ascii="Times New roman" w:hAnsi="Times New roman"/>
+          <w:sz w:val="24"/>
+          <w:szCs w:val="24"/>
+          <w:lang w:val="es-CR" w:eastAsia="zh-CN" w:bidi="hi-IN"/>
+        </w:rPr>
+      </w:pPr>
+      <w:r>
+        <w:rPr/>
+      </w:r>
+    </w:p>
+    <w:p>
+      <w:pPr>
+        <w:pStyle w:val="Heading3"/>
+        <w:numPr>
+          <w:ilvl w:val="0"/>
+          <w:numId w:val="0"/>
+        </w:numPr>
+        <w:ind w:hanging="0" w:left="0"/>
+        <w:jc w:val="both"/>
+        <w:rPr>
+          <w:rFonts w:ascii="Times New roman" w:hAnsi="Times New roman"/>
+          <w:b/>
+          <w:bCs/>
+          <w:sz w:val="24"/>
+          <w:szCs w:val="24"/>
+          <w:lang w:val="es-CR" w:eastAsia="zh-CN" w:bidi="hi-IN"/>
+        </w:rPr>
+      </w:pPr>
+      <w:r>
+        <w:rPr/>
+      </w:r>
+    </w:p>
+    <w:p>
+      <w:pPr>
+        <w:pStyle w:val="BodyText"/>
+        <w:jc w:val="both"/>
+        <w:rPr>
+          <w:rFonts w:ascii="Times New roman" w:hAnsi="Times New roman"/>
+          <w:b/>
+          <w:bCs/>
+          <w:sz w:val="24"/>
+          <w:szCs w:val="24"/>
+          <w:lang w:val="es-CR" w:eastAsia="zh-CN" w:bidi="hi-IN"/>
+        </w:rPr>
+      </w:pPr>
+      <w:r>
+        <w:rPr/>
+      </w:r>
+    </w:p>
+    <w:p>
+      <w:pPr>
+        <w:pStyle w:val="BodyText"/>
+        <w:jc w:val="both"/>
+        <w:rPr>
+          <w:rFonts w:ascii="Times New roman" w:hAnsi="Times New roman"/>
+          <w:b/>
+          <w:bCs/>
+          <w:sz w:val="24"/>
+          <w:szCs w:val="24"/>
+          <w:lang w:val="es-CR" w:eastAsia="zh-CN" w:bidi="hi-IN"/>
+        </w:rPr>
+      </w:pPr>
+      <w:r>
+        <w:rPr/>
+      </w:r>
+    </w:p>
+    <w:p>
+      <w:pPr>
+        <w:pStyle w:val="BodyText"/>
+        <w:jc w:val="both"/>
+        <w:rPr>
+          <w:rFonts w:ascii="Times New roman" w:hAnsi="Times New roman"/>
+          <w:b/>
+          <w:bCs/>
+          <w:sz w:val="24"/>
+          <w:szCs w:val="24"/>
+          <w:lang w:val="es-CR" w:eastAsia="zh-CN" w:bidi="hi-IN"/>
+        </w:rPr>
+      </w:pPr>
+      <w:r>
+        <w:rPr/>
+      </w:r>
+    </w:p>
+    <w:p>
+      <w:pPr>
+        <w:pStyle w:val="Heading3"/>
+        <w:numPr>
+          <w:ilvl w:val="0"/>
+          <w:numId w:val="0"/>
+        </w:numPr>
+        <w:ind w:hanging="0" w:left="0"/>
+        <w:jc w:val="both"/>
+        <w:rPr/>
+      </w:pPr>
+      <w:r>
+        <w:rPr>
+          <w:rFonts w:ascii="Times New roman" w:hAnsi="Times New roman"/>
+          <w:b/>
+          <w:bCs/>
+          <w:sz w:val="24"/>
+          <w:szCs w:val="24"/>
+          <w:lang w:val="es-CR" w:eastAsia="zh-CN" w:bidi="hi-IN"/>
+        </w:rPr>
+        <w:t>Solución del problema:</w:t>
+      </w:r>
+    </w:p>
+    <w:p>
+      <w:pPr>
+        <w:pStyle w:val="BodyText"/>
+        <w:jc w:val="both"/>
+        <w:rPr>
+          <w:rFonts w:ascii="Times New roman" w:hAnsi="Times New roman"/>
+          <w:b/>
+          <w:bCs/>
+          <w:sz w:val="24"/>
+          <w:szCs w:val="24"/>
+          <w:lang w:val="es-CR" w:eastAsia="zh-CN" w:bidi="hi-IN"/>
+        </w:rPr>
+      </w:pPr>
+      <w:r>
+        <w:rPr/>
+      </w:r>
+    </w:p>
+    <w:p>
+      <w:pPr>
+        <w:pStyle w:val="BodyText"/>
+        <w:jc w:val="both"/>
+        <w:rPr>
+          <w:rFonts w:ascii="Times New roman" w:hAnsi="Times New roman"/>
+          <w:b/>
+          <w:bCs/>
+          <w:sz w:val="24"/>
+          <w:szCs w:val="24"/>
+          <w:lang w:val="es-CR" w:eastAsia="zh-CN" w:bidi="hi-IN"/>
+        </w:rPr>
+      </w:pPr>
+      <w:r>
+        <w:rPr/>
+      </w:r>
+    </w:p>
+    <w:p>
+      <w:pPr>
+        <w:pStyle w:val="BodyText"/>
+        <w:jc w:val="both"/>
+        <w:rPr>
+          <w:rFonts w:ascii="Times New roman" w:hAnsi="Times New roman"/>
+          <w:b/>
+          <w:bCs/>
+          <w:sz w:val="24"/>
+          <w:szCs w:val="24"/>
+          <w:lang w:val="es-CR" w:eastAsia="zh-CN" w:bidi="hi-IN"/>
+        </w:rPr>
+      </w:pPr>
+      <w:r>
+        <w:rPr/>
+      </w:r>
+    </w:p>
+    <w:p>
+      <w:pPr>
+        <w:pStyle w:val="BodyText"/>
+        <w:jc w:val="both"/>
+        <w:rPr>
+          <w:rFonts w:ascii="Times New roman" w:hAnsi="Times New roman"/>
+          <w:b/>
+          <w:bCs/>
+          <w:sz w:val="24"/>
+          <w:szCs w:val="24"/>
+          <w:lang w:val="es-CR" w:eastAsia="zh-CN" w:bidi="hi-IN"/>
+        </w:rPr>
+      </w:pPr>
+      <w:r>
+        <w:rPr/>
+      </w:r>
+    </w:p>
+    <w:p>
+      <w:pPr>
+        <w:pStyle w:val="BodyText"/>
+        <w:jc w:val="both"/>
+        <w:rPr>
+          <w:rFonts w:ascii="Times New roman" w:hAnsi="Times New roman"/>
+          <w:b/>
+          <w:bCs/>
+          <w:sz w:val="24"/>
+          <w:szCs w:val="24"/>
+          <w:lang w:val="es-CR" w:eastAsia="zh-CN" w:bidi="hi-IN"/>
+        </w:rPr>
+      </w:pPr>
+      <w:r>
+        <w:rPr/>
+      </w:r>
+    </w:p>
+    <w:p>
+      <w:pPr>
+        <w:pStyle w:val="BodyText"/>
+        <w:jc w:val="both"/>
+        <w:rPr>
+          <w:rFonts w:ascii="Times New roman" w:hAnsi="Times New roman"/>
+          <w:b/>
+          <w:bCs/>
+          <w:sz w:val="24"/>
+          <w:szCs w:val="24"/>
+          <w:lang w:val="es-CR" w:eastAsia="zh-CN" w:bidi="hi-IN"/>
+        </w:rPr>
+      </w:pPr>
+      <w:r>
+        <w:rPr/>
+      </w:r>
+    </w:p>
+    <w:p>
+      <w:pPr>
+        <w:pStyle w:val="BodyText"/>
+        <w:jc w:val="both"/>
+        <w:rPr>
+          <w:rFonts w:ascii="Times New roman" w:hAnsi="Times New roman"/>
+          <w:b/>
+          <w:bCs/>
+          <w:sz w:val="24"/>
+          <w:szCs w:val="24"/>
+          <w:lang w:val="es-CR" w:eastAsia="zh-CN" w:bidi="hi-IN"/>
+        </w:rPr>
+      </w:pPr>
+      <w:r>
+        <w:rPr/>
+      </w:r>
+    </w:p>
+    <w:p>
+      <w:pPr>
+        <w:pStyle w:val="BodyText"/>
+        <w:jc w:val="both"/>
+        <w:rPr>
+          <w:rFonts w:ascii="Times New roman" w:hAnsi="Times New roman"/>
+          <w:b/>
+          <w:bCs/>
+          <w:sz w:val="24"/>
+          <w:szCs w:val="24"/>
+          <w:lang w:val="es-CR" w:eastAsia="zh-CN" w:bidi="hi-IN"/>
+        </w:rPr>
+      </w:pPr>
+      <w:r>
+        <w:rPr/>
+      </w:r>
+    </w:p>
+    <w:p>
+      <w:pPr>
+        <w:pStyle w:val="BodyText"/>
+        <w:jc w:val="both"/>
+        <w:rPr>
+          <w:rFonts w:ascii="Times New roman" w:hAnsi="Times New roman"/>
+          <w:b/>
+          <w:bCs/>
+          <w:sz w:val="24"/>
+          <w:szCs w:val="24"/>
+          <w:lang w:val="es-CR" w:eastAsia="zh-CN" w:bidi="hi-IN"/>
+        </w:rPr>
+      </w:pPr>
+      <w:r>
+        <w:rPr/>
+      </w:r>
+    </w:p>
+    <w:p>
+      <w:pPr>
+        <w:pStyle w:val="BodyText"/>
+        <w:jc w:val="both"/>
+        <w:rPr>
+          <w:rFonts w:ascii="Times New roman" w:hAnsi="Times New roman"/>
+          <w:b/>
+          <w:bCs/>
+          <w:sz w:val="24"/>
+          <w:szCs w:val="24"/>
+          <w:lang w:val="es-CR" w:eastAsia="zh-CN" w:bidi="hi-IN"/>
+        </w:rPr>
+      </w:pPr>
+      <w:r>
+        <w:rPr/>
+      </w:r>
+    </w:p>
+    <w:p>
+      <w:pPr>
+        <w:pStyle w:val="BodyText"/>
+        <w:jc w:val="both"/>
+        <w:rPr>
+          <w:rFonts w:ascii="Times New roman" w:hAnsi="Times New roman"/>
+          <w:b/>
+          <w:bCs/>
+          <w:sz w:val="24"/>
+          <w:szCs w:val="24"/>
+          <w:lang w:val="es-CR" w:eastAsia="zh-CN" w:bidi="hi-IN"/>
+        </w:rPr>
+      </w:pPr>
+      <w:r>
+        <w:rPr/>
+      </w:r>
+    </w:p>
+    <w:p>
+      <w:pPr>
+        <w:pStyle w:val="BodyText"/>
+        <w:jc w:val="both"/>
+        <w:rPr>
+          <w:rFonts w:ascii="Times New roman" w:hAnsi="Times New roman"/>
+          <w:b/>
+          <w:bCs/>
+          <w:sz w:val="24"/>
+          <w:szCs w:val="24"/>
+          <w:lang w:val="es-CR" w:eastAsia="zh-CN" w:bidi="hi-IN"/>
+        </w:rPr>
+      </w:pPr>
+      <w:r>
+        <w:rPr/>
+      </w:r>
+    </w:p>
+    <w:p>
+      <w:pPr>
+        <w:pStyle w:val="BodyText"/>
+        <w:jc w:val="both"/>
+        <w:rPr>
+          <w:rFonts w:ascii="Times New roman" w:hAnsi="Times New roman"/>
+          <w:b/>
+          <w:bCs/>
+          <w:sz w:val="24"/>
+          <w:szCs w:val="24"/>
+          <w:lang w:val="es-CR" w:eastAsia="zh-CN" w:bidi="hi-IN"/>
+        </w:rPr>
+      </w:pPr>
+      <w:r>
+        <w:rPr/>
+      </w:r>
+    </w:p>
+    <w:p>
+      <w:pPr>
+        <w:pStyle w:val="BodyText"/>
+        <w:jc w:val="both"/>
+        <w:rPr>
+          <w:rFonts w:ascii="Times New roman" w:hAnsi="Times New roman"/>
+          <w:b/>
+          <w:bCs/>
+          <w:sz w:val="24"/>
+          <w:szCs w:val="24"/>
+          <w:lang w:val="es-CR" w:eastAsia="zh-CN" w:bidi="hi-IN"/>
+        </w:rPr>
+      </w:pPr>
+      <w:r>
+        <w:rPr/>
+      </w:r>
+    </w:p>
+    <w:p>
+      <w:pPr>
+        <w:pStyle w:val="BodyText"/>
+        <w:jc w:val="both"/>
+        <w:rPr>
+          <w:rFonts w:ascii="Times New roman" w:hAnsi="Times New roman"/>
+          <w:b/>
+          <w:bCs/>
+          <w:sz w:val="24"/>
+          <w:szCs w:val="24"/>
+          <w:lang w:val="es-CR" w:eastAsia="zh-CN" w:bidi="hi-IN"/>
+        </w:rPr>
+      </w:pPr>
+      <w:r>
+        <w:rPr/>
+      </w:r>
+    </w:p>
+    <w:p>
+      <w:pPr>
+        <w:pStyle w:val="BodyText"/>
+        <w:jc w:val="both"/>
+        <w:rPr>
+          <w:rFonts w:ascii="Times New roman" w:hAnsi="Times New roman"/>
+          <w:b/>
+          <w:bCs/>
+          <w:sz w:val="24"/>
+          <w:szCs w:val="24"/>
+          <w:lang w:val="es-CR" w:eastAsia="zh-CN" w:bidi="hi-IN"/>
+        </w:rPr>
+      </w:pPr>
+      <w:r>
+        <w:rPr/>
+      </w:r>
+    </w:p>
+    <w:p>
+      <w:pPr>
+        <w:pStyle w:val="BodyText"/>
+        <w:jc w:val="both"/>
+        <w:rPr>
+          <w:rFonts w:ascii="Times New roman" w:hAnsi="Times New roman"/>
+          <w:b/>
+          <w:bCs/>
+          <w:sz w:val="24"/>
+          <w:szCs w:val="24"/>
+          <w:lang w:val="es-CR" w:eastAsia="zh-CN" w:bidi="hi-IN"/>
+        </w:rPr>
+      </w:pPr>
+      <w:r>
+        <w:rPr/>
+      </w:r>
+    </w:p>
+    <w:p>
+      <w:pPr>
+        <w:pStyle w:val="BodyText"/>
+        <w:jc w:val="both"/>
+        <w:rPr>
+          <w:rFonts w:ascii="Times New roman" w:hAnsi="Times New roman"/>
+          <w:b/>
+          <w:bCs/>
+          <w:sz w:val="24"/>
+          <w:szCs w:val="24"/>
+          <w:lang w:val="es-CR" w:eastAsia="zh-CN" w:bidi="hi-IN"/>
+        </w:rPr>
+      </w:pPr>
+      <w:r>
+        <w:rPr/>
+      </w:r>
+    </w:p>
+    <w:p>
+      <w:pPr>
+        <w:pStyle w:val="BodyText"/>
+        <w:jc w:val="both"/>
+        <w:rPr>
+          <w:rFonts w:ascii="Times New roman" w:hAnsi="Times New roman"/>
+          <w:b/>
+          <w:bCs/>
+          <w:sz w:val="24"/>
+          <w:szCs w:val="24"/>
+          <w:lang w:val="es-CR" w:eastAsia="zh-CN" w:bidi="hi-IN"/>
+        </w:rPr>
+      </w:pPr>
+      <w:r>
+        <w:rPr/>
+      </w:r>
+    </w:p>
+    <w:p>
+      <w:pPr>
+        <w:pStyle w:val="BodyText"/>
+        <w:jc w:val="both"/>
+        <w:rPr>
+          <w:rFonts w:ascii="Times New roman" w:hAnsi="Times New roman"/>
+          <w:b/>
+          <w:bCs/>
+          <w:sz w:val="24"/>
+          <w:szCs w:val="24"/>
+          <w:lang w:val="es-CR" w:eastAsia="zh-CN" w:bidi="hi-IN"/>
+        </w:rPr>
+      </w:pPr>
+      <w:r>
+        <w:rPr/>
+      </w:r>
+    </w:p>
+    <w:p>
+      <w:pPr>
+        <w:pStyle w:val="BodyText"/>
+        <w:jc w:val="both"/>
+        <w:rPr>
+          <w:rFonts w:ascii="Times New roman" w:hAnsi="Times New roman"/>
+          <w:b/>
+          <w:bCs/>
+          <w:sz w:val="24"/>
+          <w:szCs w:val="24"/>
+          <w:lang w:val="es-CR" w:eastAsia="zh-CN" w:bidi="hi-IN"/>
+        </w:rPr>
+      </w:pPr>
+      <w:r>
+        <w:rPr/>
+      </w:r>
+    </w:p>
+    <w:p>
+      <w:pPr>
+        <w:pStyle w:val="BodyText"/>
+        <w:jc w:val="both"/>
+        <w:rPr>
+          <w:rFonts w:ascii="Times New roman" w:hAnsi="Times New roman"/>
+          <w:b/>
+          <w:bCs/>
+          <w:sz w:val="24"/>
+          <w:szCs w:val="24"/>
+          <w:lang w:val="es-CR" w:eastAsia="zh-CN" w:bidi="hi-IN"/>
+        </w:rPr>
+      </w:pPr>
+      <w:r>
+        <w:rPr/>
+      </w:r>
+    </w:p>
+    <w:p>
+      <w:pPr>
+        <w:pStyle w:val="BodyText"/>
+        <w:jc w:val="both"/>
+        <w:rPr>
+          <w:rFonts w:ascii="Times New roman" w:hAnsi="Times New roman"/>
+          <w:b/>
+          <w:bCs/>
+          <w:sz w:val="24"/>
+          <w:szCs w:val="24"/>
+          <w:lang w:val="es-CR" w:eastAsia="zh-CN" w:bidi="hi-IN"/>
+        </w:rPr>
+      </w:pPr>
+      <w:r>
+        <w:rPr/>
+      </w:r>
+    </w:p>
+    <w:p>
+      <w:pPr>
+        <w:pStyle w:val="BodyText"/>
+        <w:jc w:val="both"/>
+        <w:rPr>
+          <w:rFonts w:ascii="Times New roman" w:hAnsi="Times New roman"/>
+          <w:b/>
+          <w:bCs/>
+          <w:sz w:val="24"/>
+          <w:szCs w:val="24"/>
+          <w:lang w:val="es-CR" w:eastAsia="zh-CN" w:bidi="hi-IN"/>
+        </w:rPr>
+      </w:pPr>
+      <w:r>
+        <w:rPr/>
+      </w:r>
+    </w:p>
+    <w:p>
+      <w:pPr>
+        <w:pStyle w:val="BodyText"/>
+        <w:jc w:val="both"/>
+        <w:rPr>
+          <w:rFonts w:ascii="Times New roman" w:hAnsi="Times New roman"/>
+          <w:b/>
+          <w:bCs/>
+          <w:sz w:val="24"/>
+          <w:szCs w:val="24"/>
+          <w:lang w:val="es-CR" w:eastAsia="zh-CN" w:bidi="hi-IN"/>
+        </w:rPr>
+      </w:pPr>
+      <w:r>
+        <w:rPr/>
+      </w:r>
+    </w:p>
+    <w:p>
+      <w:pPr>
+        <w:pStyle w:val="BodyText"/>
+        <w:jc w:val="both"/>
+        <w:rPr>
+          <w:rFonts w:ascii="Times New roman" w:hAnsi="Times New roman"/>
+          <w:b/>
+          <w:bCs/>
+          <w:sz w:val="24"/>
+          <w:szCs w:val="24"/>
+          <w:lang w:val="es-CR" w:eastAsia="zh-CN" w:bidi="hi-IN"/>
+        </w:rPr>
+      </w:pPr>
+      <w:r>
+        <w:rPr/>
+      </w:r>
+    </w:p>
+    <w:p>
+      <w:pPr>
+        <w:pStyle w:val="BodyText"/>
+        <w:jc w:val="both"/>
+        <w:rPr>
+          <w:rFonts w:ascii="Times New roman" w:hAnsi="Times New roman"/>
+          <w:b/>
+          <w:bCs/>
+          <w:sz w:val="24"/>
+          <w:szCs w:val="24"/>
+          <w:lang w:val="es-CR" w:eastAsia="zh-CN" w:bidi="hi-IN"/>
+        </w:rPr>
+      </w:pPr>
+      <w:r>
+        <w:rPr/>
+      </w:r>
+    </w:p>
+    <w:p>
+      <w:pPr>
+        <w:pStyle w:val="BodyText"/>
+        <w:jc w:val="both"/>
+        <w:rPr>
+          <w:rFonts w:ascii="Times New roman" w:hAnsi="Times New roman"/>
+          <w:b/>
+          <w:bCs/>
+          <w:sz w:val="24"/>
+          <w:szCs w:val="24"/>
+          <w:lang w:val="es-CR" w:eastAsia="zh-CN" w:bidi="hi-IN"/>
+        </w:rPr>
+      </w:pPr>
+      <w:r>
+        <w:rPr/>
+      </w:r>
+    </w:p>
+    <w:p>
+      <w:pPr>
+        <w:pStyle w:val="BodyText"/>
+        <w:jc w:val="both"/>
+        <w:rPr>
+          <w:rFonts w:ascii="Times New roman" w:hAnsi="Times New roman"/>
+          <w:b/>
+          <w:bCs/>
+          <w:sz w:val="24"/>
+          <w:szCs w:val="24"/>
+          <w:lang w:val="es-CR" w:eastAsia="zh-CN" w:bidi="hi-IN"/>
+        </w:rPr>
+      </w:pPr>
+      <w:r>
+        <w:rPr/>
+      </w:r>
+    </w:p>
+    <w:p>
+      <w:pPr>
+        <w:pStyle w:val="BodyText"/>
+        <w:jc w:val="both"/>
+        <w:rPr>
+          <w:rFonts w:ascii="Times New roman" w:hAnsi="Times New roman"/>
+          <w:b/>
+          <w:bCs/>
+          <w:sz w:val="24"/>
+          <w:szCs w:val="24"/>
+          <w:lang w:val="es-CR" w:eastAsia="zh-CN" w:bidi="hi-IN"/>
+        </w:rPr>
+      </w:pPr>
+      <w:r>
+        <w:rPr/>
+      </w:r>
+    </w:p>
+    <w:p>
+      <w:pPr>
+        <w:pStyle w:val="BodyText"/>
+        <w:jc w:val="both"/>
+        <w:rPr>
+          <w:rFonts w:ascii="Times New roman" w:hAnsi="Times New roman"/>
+          <w:b/>
+          <w:bCs/>
+          <w:sz w:val="24"/>
+          <w:szCs w:val="24"/>
+          <w:lang w:val="es-CR" w:eastAsia="zh-CN" w:bidi="hi-IN"/>
+        </w:rPr>
+      </w:pPr>
+      <w:r>
+        <w:rPr/>
+      </w:r>
+    </w:p>
+    <w:p>
+      <w:pPr>
+        <w:pStyle w:val="Heading4"/>
+        <w:numPr>
+          <w:ilvl w:val="0"/>
+          <w:numId w:val="0"/>
+        </w:numPr>
+        <w:ind w:hanging="0" w:left="0"/>
+        <w:jc w:val="both"/>
+        <w:rPr>
+          <w:rFonts w:ascii="Times New roman" w:hAnsi="Times New roman"/>
+          <w:i w:val="false"/>
+          <w:i w:val="false"/>
+          <w:iCs w:val="false"/>
+          <w:sz w:val="24"/>
+          <w:szCs w:val="24"/>
+          <w:lang w:val="es-CR" w:eastAsia="zh-CN" w:bidi="hi-IN"/>
+        </w:rPr>
+      </w:pPr>
+      <w:r>
+        <w:rPr>
+          <w:rFonts w:ascii="Times New roman" w:hAnsi="Times New roman"/>
+          <w:i w:val="false"/>
+          <w:iCs w:val="false"/>
+          <w:sz w:val="24"/>
+          <w:szCs w:val="24"/>
+          <w:lang w:val="es-CR" w:eastAsia="zh-CN" w:bidi="hi-IN"/>
+        </w:rPr>
+        <w:t>Análisis de resultados:</w:t>
+      </w:r>
+      <w:r>
+        <w:br w:type="page"/>
+      </w:r>
+    </w:p>
+    <w:p>
+      <w:pPr>
+        <w:pStyle w:val="Heading5"/>
+        <w:numPr>
+          <w:ilvl w:val="0"/>
+          <w:numId w:val="0"/>
+        </w:numPr>
+        <w:ind w:hanging="0" w:left="0"/>
+        <w:jc w:val="both"/>
+        <w:rPr>
+          <w:rFonts w:ascii="Times New roman" w:hAnsi="Times New roman"/>
+          <w:lang w:val="zxx" w:eastAsia="zxx" w:bidi="zxx"/>
+        </w:rPr>
+      </w:pPr>
+      <w:r>
+        <w:rPr>
+          <w:rFonts w:ascii="Times New roman" w:hAnsi="Times New roman"/>
+          <w:lang w:val="zxx" w:eastAsia="zxx" w:bidi="zxx"/>
+        </w:rPr>
+        <w:t>Concluciones:</w:t>
+      </w:r>
+    </w:p>
+    <w:p>
+      <w:pPr>
+        <w:pStyle w:val="BodyText"/>
+        <w:jc w:val="both"/>
+        <w:rPr>
+          <w:rFonts w:ascii="Times New roman" w:hAnsi="Times New roman"/>
+          <w:lang w:val="zxx" w:eastAsia="zxx" w:bidi="zxx"/>
+        </w:rPr>
+      </w:pPr>
+      <w:r>
+        <w:rPr/>
+      </w:r>
+      <w:r>
+        <w:br w:type="page"/>
+      </w:r>
+    </w:p>
+    <w:p>
+      <w:pPr>
+        <w:pStyle w:val="Heading6"/>
+        <w:numPr>
+          <w:ilvl w:val="0"/>
+          <w:numId w:val="0"/>
+        </w:numPr>
+        <w:ind w:hanging="0" w:left="0"/>
+        <w:jc w:val="both"/>
+        <w:rPr>
+          <w:rFonts w:ascii="Times New roman" w:hAnsi="Times New roman"/>
+          <w:i w:val="false"/>
+          <w:i w:val="false"/>
+          <w:iCs w:val="false"/>
+          <w:lang w:val="es-CR" w:eastAsia="zh-CN" w:bidi="hi-IN"/>
+        </w:rPr>
+      </w:pPr>
+      <w:r>
+        <w:rPr>
+          <w:rFonts w:ascii="Times New roman" w:hAnsi="Times New roman"/>
+          <w:i w:val="false"/>
+          <w:iCs w:val="false"/>
+          <w:lang w:val="es-CR" w:eastAsia="zh-CN" w:bidi="hi-IN"/>
+        </w:rPr>
+        <w:t>Recomendaciones:</w:t>
+      </w:r>
+    </w:p>
+    <w:p>
+      <w:pPr>
+        <w:pStyle w:val="BodyText"/>
+        <w:jc w:val="both"/>
+        <w:rPr>
+          <w:rFonts w:ascii="Times New roman" w:hAnsi="Times New roman"/>
+          <w:i w:val="false"/>
+          <w:i w:val="false"/>
+          <w:iCs w:val="false"/>
+          <w:lang w:val="es-CR" w:eastAsia="zh-CN" w:bidi="hi-IN"/>
+        </w:rPr>
+      </w:pPr>
+      <w:r>
+        <w:rPr/>
+      </w:r>
+      <w:r>
+        <w:br w:type="page"/>
+      </w:r>
+    </w:p>
+    <w:p>
+      <w:pPr>
+        <w:pStyle w:val="Heading7"/>
+        <w:numPr>
+          <w:ilvl w:val="0"/>
+          <w:numId w:val="0"/>
+        </w:numPr>
+        <w:spacing w:before="60" w:after="60"/>
+        <w:ind w:hanging="0" w:left="0"/>
+        <w:jc w:val="both"/>
+        <w:rPr>
+          <w:rFonts w:ascii="Times New Roman" w:hAnsi="Times New Roman"/>
+          <w:sz w:val="24"/>
+          <w:szCs w:val="24"/>
+          <w:lang w:val="es-CR" w:eastAsia="zh-CN" w:bidi="hi-IN"/>
+        </w:rPr>
+      </w:pPr>
+      <w:r>
+        <w:rPr>
+          <w:rFonts w:ascii="Times New Roman" w:hAnsi="Times New Roman"/>
+          <w:sz w:val="24"/>
+          <w:szCs w:val="24"/>
+          <w:lang w:val="es-CR" w:eastAsia="zh-CN" w:bidi="hi-IN"/>
+        </w:rPr>
+        <w:t>Referencias bibliográficas:</w:t>
       </w:r>
     </w:p>
     <w:sectPr>
@@ -971,7 +1998,6 @@
         </w:tabs>
         <w:ind w:left="0" w:hanging="0"/>
       </w:pPr>
-      <w:rPr/>
     </w:lvl>
     <w:lvl w:ilvl="1">
       <w:start w:val="1"/>
@@ -985,10 +2011,10 @@
         </w:tabs>
         <w:ind w:left="0" w:hanging="0"/>
       </w:pPr>
-      <w:rPr/>
     </w:lvl>
     <w:lvl w:ilvl="2">
       <w:start w:val="1"/>
+      <w:pStyle w:val="Heading3"/>
       <w:numFmt w:val="none"/>
       <w:suff w:val="nothing"/>
       <w:lvlText w:val=""/>
@@ -999,10 +2025,10 @@
         </w:tabs>
         <w:ind w:left="0" w:hanging="0"/>
       </w:pPr>
-      <w:rPr/>
     </w:lvl>
     <w:lvl w:ilvl="3">
       <w:start w:val="1"/>
+      <w:pStyle w:val="Heading4"/>
       <w:numFmt w:val="none"/>
       <w:suff w:val="nothing"/>
       <w:lvlText w:val=""/>
@@ -1013,10 +2039,10 @@
         </w:tabs>
         <w:ind w:left="0" w:hanging="0"/>
       </w:pPr>
-      <w:rPr/>
     </w:lvl>
     <w:lvl w:ilvl="4">
       <w:start w:val="1"/>
+      <w:pStyle w:val="Heading5"/>
       <w:numFmt w:val="none"/>
       <w:suff w:val="nothing"/>
       <w:lvlText w:val=""/>
@@ -1027,10 +2053,10 @@
         </w:tabs>
         <w:ind w:left="0" w:hanging="0"/>
       </w:pPr>
-      <w:rPr/>
     </w:lvl>
     <w:lvl w:ilvl="5">
       <w:start w:val="1"/>
+      <w:pStyle w:val="Heading6"/>
       <w:numFmt w:val="none"/>
       <w:suff w:val="nothing"/>
       <w:lvlText w:val=""/>
@@ -1041,10 +2067,10 @@
         </w:tabs>
         <w:ind w:left="0" w:hanging="0"/>
       </w:pPr>
-      <w:rPr/>
     </w:lvl>
     <w:lvl w:ilvl="6">
       <w:start w:val="1"/>
+      <w:pStyle w:val="Heading7"/>
       <w:numFmt w:val="none"/>
       <w:suff w:val="nothing"/>
       <w:lvlText w:val=""/>
@@ -1055,7 +2081,6 @@
         </w:tabs>
         <w:ind w:left="0" w:hanging="0"/>
       </w:pPr>
-      <w:rPr/>
     </w:lvl>
     <w:lvl w:ilvl="7">
       <w:start w:val="1"/>
@@ -1069,7 +2094,6 @@
         </w:tabs>
         <w:ind w:left="0" w:hanging="0"/>
       </w:pPr>
-      <w:rPr/>
     </w:lvl>
     <w:lvl w:ilvl="8">
       <w:start w:val="1"/>
@@ -1083,7 +2107,6 @@
         </w:tabs>
         <w:ind w:left="0" w:hanging="0"/>
       </w:pPr>
-      <w:rPr/>
     </w:lvl>
   </w:abstractNum>
   <w:abstractNum w:abstractNumId="2">
@@ -1227,6 +2250,7 @@
         </w:tabs>
         <w:ind w:left="0" w:hanging="0"/>
       </w:pPr>
+      <w:rPr/>
     </w:lvl>
     <w:lvl w:ilvl="1">
       <w:start w:val="1"/>
@@ -1240,6 +2264,7 @@
         </w:tabs>
         <w:ind w:left="0" w:hanging="0"/>
       </w:pPr>
+      <w:rPr/>
     </w:lvl>
     <w:lvl w:ilvl="2">
       <w:start w:val="1"/>
@@ -1253,6 +2278,7 @@
         </w:tabs>
         <w:ind w:left="0" w:hanging="0"/>
       </w:pPr>
+      <w:rPr/>
     </w:lvl>
     <w:lvl w:ilvl="3">
       <w:start w:val="1"/>
@@ -1266,6 +2292,7 @@
         </w:tabs>
         <w:ind w:left="0" w:hanging="0"/>
       </w:pPr>
+      <w:rPr/>
     </w:lvl>
     <w:lvl w:ilvl="4">
       <w:start w:val="1"/>
@@ -1279,6 +2306,7 @@
         </w:tabs>
         <w:ind w:left="0" w:hanging="0"/>
       </w:pPr>
+      <w:rPr/>
     </w:lvl>
     <w:lvl w:ilvl="5">
       <w:start w:val="1"/>
@@ -1292,6 +2320,7 @@
         </w:tabs>
         <w:ind w:left="0" w:hanging="0"/>
       </w:pPr>
+      <w:rPr/>
     </w:lvl>
     <w:lvl w:ilvl="6">
       <w:start w:val="1"/>
@@ -1305,6 +2334,7 @@
         </w:tabs>
         <w:ind w:left="0" w:hanging="0"/>
       </w:pPr>
+      <w:rPr/>
     </w:lvl>
     <w:lvl w:ilvl="7">
       <w:start w:val="1"/>
@@ -1318,6 +2348,7 @@
         </w:tabs>
         <w:ind w:left="0" w:hanging="0"/>
       </w:pPr>
+      <w:rPr/>
     </w:lvl>
     <w:lvl w:ilvl="8">
       <w:start w:val="1"/>
@@ -1331,6 +2362,7 @@
         </w:tabs>
         <w:ind w:left="0" w:hanging="0"/>
       </w:pPr>
+      <w:rPr/>
     </w:lvl>
   </w:abstractNum>
   <w:num w:numId="1">
@@ -1390,7 +2422,7 @@
     <w:pPr>
       <w:numPr>
         <w:ilvl w:val="0"/>
-        <w:numId w:val="2"/>
+        <w:numId w:val="3"/>
       </w:numPr>
       <w:spacing w:before="240" w:after="120"/>
       <w:outlineLvl w:val="0"/>
@@ -1410,7 +2442,7 @@
     <w:pPr>
       <w:numPr>
         <w:ilvl w:val="1"/>
-        <w:numId w:val="1"/>
+        <w:numId w:val="2"/>
       </w:numPr>
       <w:spacing w:before="200" w:after="120"/>
       <w:outlineLvl w:val="1"/>
@@ -1420,6 +2452,110 @@
       <w:bCs/>
       <w:sz w:val="32"/>
       <w:szCs w:val="32"/>
+    </w:rPr>
+  </w:style>
+  <w:style w:type="paragraph" w:styleId="Heading3">
+    <w:name w:val="Heading 3"/>
+    <w:basedOn w:val="Heading"/>
+    <w:next w:val="BodyText"/>
+    <w:qFormat/>
+    <w:pPr>
+      <w:numPr>
+        <w:ilvl w:val="2"/>
+        <w:numId w:val="1"/>
+      </w:numPr>
+      <w:spacing w:before="140" w:after="120"/>
+      <w:outlineLvl w:val="2"/>
+    </w:pPr>
+    <w:rPr>
+      <w:b/>
+      <w:bCs/>
+      <w:sz w:val="28"/>
+      <w:szCs w:val="28"/>
+    </w:rPr>
+  </w:style>
+  <w:style w:type="paragraph" w:styleId="Heading4">
+    <w:name w:val="Heading 4"/>
+    <w:basedOn w:val="Heading"/>
+    <w:next w:val="BodyText"/>
+    <w:qFormat/>
+    <w:pPr>
+      <w:numPr>
+        <w:ilvl w:val="3"/>
+        <w:numId w:val="1"/>
+      </w:numPr>
+      <w:spacing w:before="120" w:after="120"/>
+      <w:outlineLvl w:val="3"/>
+    </w:pPr>
+    <w:rPr>
+      <w:b/>
+      <w:bCs/>
+      <w:i/>
+      <w:iCs/>
+      <w:sz w:val="26"/>
+      <w:szCs w:val="26"/>
+    </w:rPr>
+  </w:style>
+  <w:style w:type="paragraph" w:styleId="Heading5">
+    <w:name w:val="Heading 5"/>
+    <w:basedOn w:val="Heading"/>
+    <w:next w:val="BodyText"/>
+    <w:qFormat/>
+    <w:pPr>
+      <w:numPr>
+        <w:ilvl w:val="4"/>
+        <w:numId w:val="1"/>
+      </w:numPr>
+      <w:spacing w:before="120" w:after="60"/>
+      <w:outlineLvl w:val="4"/>
+    </w:pPr>
+    <w:rPr>
+      <w:b/>
+      <w:bCs/>
+      <w:sz w:val="24"/>
+      <w:szCs w:val="24"/>
+    </w:rPr>
+  </w:style>
+  <w:style w:type="paragraph" w:styleId="Heading6">
+    <w:name w:val="Heading 6"/>
+    <w:basedOn w:val="Heading"/>
+    <w:next w:val="BodyText"/>
+    <w:qFormat/>
+    <w:pPr>
+      <w:numPr>
+        <w:ilvl w:val="5"/>
+        <w:numId w:val="1"/>
+      </w:numPr>
+      <w:spacing w:before="60" w:after="60"/>
+      <w:outlineLvl w:val="5"/>
+    </w:pPr>
+    <w:rPr>
+      <w:b/>
+      <w:bCs/>
+      <w:i/>
+      <w:iCs/>
+      <w:sz w:val="24"/>
+      <w:szCs w:val="24"/>
+    </w:rPr>
+  </w:style>
+  <w:style w:type="paragraph" w:styleId="Heading7">
+    <w:name w:val="Heading 7"/>
+    <w:basedOn w:val="Heading"/>
+    <w:next w:val="BodyText"/>
+    <w:qFormat/>
+    <w:pPr>
+      <w:numPr>
+        <w:ilvl w:val="6"/>
+        <w:numId w:val="1"/>
+      </w:numPr>
+      <w:spacing w:before="60" w:after="60"/>
+      <w:outlineLvl w:val="6"/>
+    </w:pPr>
+    <w:rPr>
+      <w:b/>
+      <w:bCs/>
+      <w:sz w:val="20"/>
+      <w:szCs w:val="20"/>
     </w:rPr>
   </w:style>
   <w:style w:type="paragraph" w:styleId="Heading">

</xml_diff>

<commit_message>
Arreglo de otro error de Documentacion externa
</commit_message>
<xml_diff>
--- a/Doc_externa.docx
+++ b/Doc_externa.docx
@@ -467,6 +467,7 @@
             <w:rPr>
               <w:webHidden/>
               <w:rStyle w:val="IndexLink"/>
+              <w:vanish w:val="false"/>
               <w:rFonts w:cs="Times New Roman" w:ascii="Times New Roman" w:hAnsi="Times New Roman"/>
             </w:rPr>
             <w:instrText xml:space="preserve"> TOC \z \o "1-3" \u \h</w:instrText>
@@ -475,6 +476,7 @@
             <w:rPr>
               <w:webHidden/>
               <w:rStyle w:val="IndexLink"/>
+              <w:vanish w:val="false"/>
               <w:rFonts w:cs="Times New Roman" w:ascii="Times New Roman" w:hAnsi="Times New Roman"/>
             </w:rPr>
             <w:fldChar w:fldCharType="separate"/>
@@ -485,6 +487,7 @@
                 <w:webHidden/>
                 <w:rStyle w:val="IndexLink"/>
                 <w:rFonts w:cs="Times New Roman" w:ascii="Times New Roman" w:hAnsi="Times New Roman"/>
+                <w:vanish w:val="false"/>
               </w:rPr>
               <w:t>Introducción:</w:t>
             </w:r>
@@ -542,6 +545,7 @@
                 <w:webHidden/>
                 <w:rStyle w:val="IndexLink"/>
                 <w:rFonts w:cs="Times New Roman" w:ascii="Times New Roman" w:hAnsi="Times New Roman"/>
+                <w:vanish w:val="false"/>
               </w:rPr>
               <w:t>Análisis del problema:</w:t>
             </w:r>
@@ -599,6 +603,7 @@
                 <w:webHidden/>
                 <w:rStyle w:val="IndexLink"/>
                 <w:rFonts w:cs="Times New Roman" w:ascii="Times New Roman" w:hAnsi="Times New Roman"/>
+                <w:vanish w:val="false"/>
               </w:rPr>
               <w:t>Solución del problema:</w:t>
             </w:r>
@@ -656,6 +661,7 @@
                 <w:webHidden/>
                 <w:rStyle w:val="IndexLink"/>
                 <w:rFonts w:cs="Times New Roman" w:ascii="Times New Roman" w:hAnsi="Times New Roman"/>
+                <w:vanish w:val="false"/>
               </w:rPr>
               <w:t>Análisis de resultados:</w:t>
             </w:r>
@@ -715,6 +721,7 @@
                 <w:rFonts w:cs="Times New Roman" w:ascii="Times New Roman" w:hAnsi="Times New Roman"/>
                 <w:i/>
                 <w:iCs/>
+                <w:vanish w:val="false"/>
               </w:rPr>
               <w:t>Tabla de observaciones:</w:t>
             </w:r>
@@ -774,6 +781,7 @@
                 <w:rFonts w:cs="Times New Roman" w:ascii="Times New Roman" w:hAnsi="Times New Roman"/>
                 <w:i/>
                 <w:iCs/>
+                <w:vanish w:val="false"/>
               </w:rPr>
               <w:t>Tabla de aportes al proyecto:</w:t>
             </w:r>
@@ -831,6 +839,7 @@
                 <w:webHidden/>
                 <w:rStyle w:val="IndexLink"/>
                 <w:rFonts w:cs="Times New Roman" w:ascii="Times New Roman" w:hAnsi="Times New Roman"/>
+                <w:vanish w:val="false"/>
               </w:rPr>
               <w:t>Conclusiones:</w:t>
             </w:r>
@@ -888,6 +897,7 @@
                 <w:webHidden/>
                 <w:rStyle w:val="IndexLink"/>
                 <w:rFonts w:cs="Times New Roman" w:ascii="Times New Roman" w:hAnsi="Times New Roman"/>
+                <w:vanish w:val="false"/>
               </w:rPr>
               <w:t>Recomendaciones:</w:t>
             </w:r>
@@ -945,6 +955,7 @@
                 <w:webHidden/>
                 <w:rStyle w:val="IndexLink"/>
                 <w:rFonts w:cs="Times New Roman" w:ascii="Times New Roman" w:hAnsi="Times New Roman"/>
+                <w:vanish w:val="false"/>
               </w:rPr>
               <w:t>Referencias bibliográficas:</w:t>
             </w:r>
@@ -1353,8 +1364,8 @@
           <w:szCs w:val="18"/>
         </w:rPr>
       </w:pPr>
-      <w:bookmarkStart w:id="0" w:name="_Toc232281845"/>
-      <w:bookmarkStart w:id="1" w:name="_Toc232280964"/>
+      <w:bookmarkStart w:id="0" w:name="_Toc232280964"/>
+      <w:bookmarkStart w:id="1" w:name="_Toc232281845"/>
       <w:r>
         <w:rPr>
           <w:rFonts w:cs="Times New Roman" w:ascii="Times New Roman" w:hAnsi="Times New Roman"/>
@@ -1592,8 +1603,8 @@
           <w:szCs w:val="18"/>
         </w:rPr>
       </w:pPr>
-      <w:bookmarkStart w:id="2" w:name="_Toc232281846"/>
-      <w:bookmarkStart w:id="3" w:name="_Toc232280965"/>
+      <w:bookmarkStart w:id="2" w:name="_Toc232280965"/>
+      <w:bookmarkStart w:id="3" w:name="_Toc232281846"/>
       <w:r>
         <w:rPr>
           <w:rFonts w:cs="Times New Roman" w:ascii="Times New Roman" w:hAnsi="Times New Roman"/>
@@ -2076,8 +2087,8 @@
           <w:szCs w:val="24"/>
         </w:rPr>
       </w:pPr>
-      <w:bookmarkStart w:id="4" w:name="_Toc232281847"/>
-      <w:bookmarkStart w:id="5" w:name="_Toc232280966"/>
+      <w:bookmarkStart w:id="4" w:name="_Toc232280966"/>
+      <w:bookmarkStart w:id="5" w:name="_Toc232281847"/>
       <w:r>
         <w:rPr>
           <w:rFonts w:cs="Times New Roman" w:ascii="Times New Roman" w:hAnsi="Times New Roman"/>
@@ -2737,7 +2748,7 @@
       </w:tblGrid>
       <w:tr>
         <w:trPr>
-          <w:trHeight w:val="1937" w:hRule="atLeast"/>
+          <w:trHeight w:val="732" w:hRule="atLeast"/>
         </w:trPr>
         <w:tc>
           <w:tcPr>
@@ -2892,10 +2903,9 @@
                 <w:bCs w:val="false"/>
                 <w:i w:val="false"/>
                 <w:iCs w:val="false"/>
-                <w:kern w:val="2"/>
-                <w:sz w:val="24"/>
-                <w:szCs w:val="24"/>
-                <w:lang w:val="es-CR" w:eastAsia="zh-CN" w:bidi="hi-IN"/>
+                <w:sz w:val="24"/>
+                <w:szCs w:val="24"/>
+                <w:lang w:val="es-CR"/>
               </w:rPr>
             </w:r>
           </w:p>
@@ -3300,10 +3310,9 @@
                 <w:i w:val="false"/>
                 <w:iCs w:val="false"/>
                 <w:vanish/>
-                <w:kern w:val="2"/>
-                <w:sz w:val="24"/>
-                <w:szCs w:val="24"/>
-                <w:lang w:val="es-CR" w:eastAsia="zh-CN" w:bidi="hi-IN"/>
+                <w:sz w:val="24"/>
+                <w:szCs w:val="24"/>
+                <w:lang w:val="es-CR"/>
               </w:rPr>
             </w:r>
           </w:p>
@@ -3401,10 +3410,9 @@
                 <w:bCs w:val="false"/>
                 <w:i w:val="false"/>
                 <w:iCs w:val="false"/>
-                <w:kern w:val="2"/>
-                <w:sz w:val="24"/>
-                <w:szCs w:val="24"/>
-                <w:lang w:val="es-CR" w:eastAsia="zh-CN" w:bidi="hi-IN"/>
+                <w:sz w:val="24"/>
+                <w:szCs w:val="24"/>
+                <w:lang w:val="es-CR"/>
               </w:rPr>
             </w:r>
           </w:p>
@@ -3548,7 +3556,7 @@
       </w:tr>
       <w:tr>
         <w:trPr>
-          <w:trHeight w:val="1937" w:hRule="atLeast"/>
+          <w:trHeight w:val="1698" w:hRule="atLeast"/>
         </w:trPr>
         <w:tc>
           <w:tcPr>
@@ -3673,10 +3681,9 @@
                 <w:i w:val="false"/>
                 <w:iCs w:val="false"/>
                 <w:vanish/>
-                <w:kern w:val="2"/>
-                <w:sz w:val="24"/>
-                <w:szCs w:val="24"/>
-                <w:lang w:val="es-CR" w:eastAsia="zh-CN" w:bidi="hi-IN"/>
+                <w:sz w:val="24"/>
+                <w:szCs w:val="24"/>
+                <w:lang w:val="es-CR"/>
               </w:rPr>
             </w:r>
           </w:p>
@@ -3774,10 +3781,9 @@
                 <w:bCs w:val="false"/>
                 <w:i w:val="false"/>
                 <w:iCs w:val="false"/>
-                <w:kern w:val="2"/>
-                <w:sz w:val="24"/>
-                <w:szCs w:val="24"/>
-                <w:lang w:val="es-CR" w:eastAsia="zh-CN" w:bidi="hi-IN"/>
+                <w:sz w:val="24"/>
+                <w:szCs w:val="24"/>
+                <w:lang w:val="es-CR"/>
               </w:rPr>
             </w:r>
           </w:p>
@@ -3785,7 +3791,7 @@
       </w:tr>
       <w:tr>
         <w:trPr>
-          <w:trHeight w:val="1937" w:hRule="atLeast"/>
+          <w:trHeight w:val="1645" w:hRule="atLeast"/>
         </w:trPr>
         <w:tc>
           <w:tcPr>
@@ -3921,7 +3927,7 @@
       </w:tr>
       <w:tr>
         <w:trPr>
-          <w:trHeight w:val="1937" w:hRule="atLeast"/>
+          <w:trHeight w:val="1632" w:hRule="atLeast"/>
         </w:trPr>
         <w:tc>
           <w:tcPr>
@@ -4057,7 +4063,7 @@
       </w:tr>
       <w:tr>
         <w:trPr>
-          <w:trHeight w:val="1937" w:hRule="atLeast"/>
+          <w:trHeight w:val="1675" w:hRule="atLeast"/>
         </w:trPr>
         <w:tc>
           <w:tcPr>
@@ -4193,7 +4199,7 @@
       </w:tr>
       <w:tr>
         <w:trPr>
-          <w:trHeight w:val="1937" w:hRule="atLeast"/>
+          <w:trHeight w:val="1673" w:hRule="atLeast"/>
         </w:trPr>
         <w:tc>
           <w:tcPr>
@@ -4329,7 +4335,7 @@
       </w:tr>
       <w:tr>
         <w:trPr>
-          <w:trHeight w:val="1937" w:hRule="atLeast"/>
+          <w:trHeight w:val="1041" w:hRule="atLeast"/>
         </w:trPr>
         <w:tc>
           <w:tcPr>

</xml_diff>